<commit_message>
Manuscript: past tense throughout, response time, consent, orientation, figure placeholders
- Chapters I to IV now describe the completed study in past tense.
- Response time (11.7 ms) reported; performance criterion now met.
- Student assent stated; missing parental consent noted as a limitation.
- Questionnaire adapted from a published study (citation placeholder).
- Orientation on October 12, 2026 added to Chapters III and V.
- Placeholders for Figures 24-29 (Chapter IV) and 36-37 (Chapter V).

Co-Authored-By: Claude Opus 5.5 <noreply@anthropic.com>
Claude-Session: https://claude.ai/code/session_013nSRu92KgA9YCzdF5bkKhr
</commit_message>
<xml_diff>
--- a/docs/manuscript/LSIAMS_Manuscript_Final.docx
+++ b/docs/manuscript/LSIAMS_Manuscript_Final.docx
@@ -923,7 +923,7 @@
           <w:bCs/>
         </w:rPr>
         <w:tab/>
-        <w:t>86</w:t>
+        <w:t>87</w:t>
       </w:r>
     </w:p>
     <w:p>
@@ -939,7 +939,7 @@
       </w:r>
       <w:r>
         <w:tab/>
-        <w:t>86</w:t>
+        <w:t>87</w:t>
       </w:r>
     </w:p>
     <w:p>
@@ -955,7 +955,7 @@
       </w:r>
       <w:r>
         <w:tab/>
-        <w:t>87</w:t>
+        <w:t>88</w:t>
       </w:r>
     </w:p>
     <w:p>
@@ -971,7 +971,7 @@
       </w:r>
       <w:r>
         <w:tab/>
-        <w:t>88</w:t>
+        <w:t>89</w:t>
       </w:r>
     </w:p>
     <w:p>
@@ -987,7 +987,7 @@
       </w:r>
       <w:r>
         <w:tab/>
-        <w:t>88</w:t>
+        <w:t>89</w:t>
       </w:r>
     </w:p>
     <w:p>
@@ -1003,7 +1003,7 @@
       </w:r>
       <w:r>
         <w:tab/>
-        <w:t>91</w:t>
+        <w:t>92</w:t>
       </w:r>
     </w:p>
     <w:p>
@@ -1019,7 +1019,7 @@
       </w:r>
       <w:r>
         <w:tab/>
-        <w:t>98</w:t>
+        <w:t>99</w:t>
       </w:r>
     </w:p>
     <w:p>
@@ -1035,7 +1035,7 @@
       </w:r>
       <w:r>
         <w:tab/>
-        <w:t>100</w:t>
+        <w:t>102</w:t>
       </w:r>
     </w:p>
     <w:p>
@@ -1058,7 +1058,7 @@
           <w:bCs/>
         </w:rPr>
         <w:tab/>
-        <w:t>102</w:t>
+        <w:t>104</w:t>
       </w:r>
     </w:p>
     <w:p>
@@ -1074,7 +1074,7 @@
       </w:r>
       <w:r>
         <w:tab/>
-        <w:t>102</w:t>
+        <w:t>104</w:t>
       </w:r>
     </w:p>
     <w:p>
@@ -1090,7 +1090,7 @@
       </w:r>
       <w:r>
         <w:tab/>
-        <w:t>104</w:t>
+        <w:t>106</w:t>
       </w:r>
     </w:p>
     <w:p>
@@ -1106,7 +1106,7 @@
       </w:r>
       <w:r>
         <w:tab/>
-        <w:t>106</w:t>
+        <w:t>108</w:t>
       </w:r>
     </w:p>
     <w:p>
@@ -1129,7 +1129,7 @@
           <w:bCs/>
         </w:rPr>
         <w:tab/>
-        <w:t>108</w:t>
+        <w:t>110</w:t>
       </w:r>
     </w:p>
     <w:p>
@@ -1252,7 +1252,7 @@
         <w:jc w:val="both"/>
       </w:pPr>
       <w:r>
-        <w:t>Through this implementation, the study aims to improve attendance accuracy, reduce processing time, minimize congestion, and enhance the security and reliability of attendance data.</w:t>
+        <w:t>Through this implementation, the study sought to improve attendance accuracy, reduce processing time, minimize congestion, and enhance the security and reliability of attendance data.</w:t>
       </w:r>
     </w:p>
     <w:p>
@@ -1435,7 +1435,7 @@
         <w:jc w:val="both"/>
       </w:pPr>
       <w:r>
-        <w:t>Specifically, this study seeks to answer the following questions:</w:t>
+        <w:t>Specifically, this study sought to answer the following questions:</w:t>
       </w:r>
     </w:p>
     <w:p>
@@ -1519,7 +1519,7 @@
         <w:jc w:val="both"/>
       </w:pPr>
       <w:r>
-        <w:t>The main goal of this study is to design, implement, and evaluate L-SIAMS: A Local IoT-Based Multi-Layer Secured Attendance Monitoring System with RFID and Biometric Authentication that improves classroom-level attendance monitoring, reduces processing time, and ensures data security through the application of robust cybersecurity mechanisms.</w:t>
+        <w:t>The main goal of this study was to design, implement, and evaluate L-SIAMS: A Local IoT-Based Multi-Layer Secured Attendance Monitoring System with RFID and Biometric Authentication that improves classroom-level attendance monitoring, reduces processing time, and ensures data security through the application of robust cybersecurity mechanisms.</w:t>
       </w:r>
     </w:p>
     <w:p>
@@ -1848,7 +1848,7 @@
         <w:jc w:val="both"/>
       </w:pPr>
       <w:r>
-        <w:t>This study focuses on the design, development, and implementation of L-SIAMS: A Local IoT-Based Multi-Layer Secured Attendance Monitoring System with RFID and Biometric Authentication. The system records student attendance at the classroom level using RFID technology integrated with IoT devices. It includes biometric fingerprint authentication for teacher verification and a locally hosted web-based platform for managing attendance data.</w:t>
+        <w:t>This study focused on the design, development, and implementation of L-SIAMS: A Local IoT-Based Multi-Layer Secured Attendance Monitoring System with RFID and Biometric Authentication. The system records student attendance at the classroom level using RFID technology integrated with IoT devices. It includes biometric fingerprint authentication for teacher verification and a locally hosted web-based platform for managing attendance data.</w:t>
       </w:r>
     </w:p>
     <w:p>
@@ -1858,7 +1858,7 @@
         <w:jc w:val="both"/>
       </w:pPr>
       <w:r>
-        <w:t>The system implements multi-layer security mechanisms such as encrypted communication, per-device request authentication, Role-Based Access Control (RBAC), network access control, and audit logging. It will be evaluated using ISO/IEC 27001 and the CIA Triad.</w:t>
+        <w:t>The system implements multi-layer security mechanisms such as encrypted communication, per-device request authentication, Role-Based Access Control (RBAC), network access control, and audit logging. It was evaluated using ISO/IEC 27001 and the CIA Triad.</w:t>
       </w:r>
     </w:p>
     <w:p>
@@ -1878,11 +1878,11 @@
         <w:jc w:val="both"/>
       </w:pPr>
       <w:r>
-        <w:t xml:space="preserve">The system operates within a Local Area Network (LAN) and is not integrated with cloud-based or external systems. As a result, it has no remote access, limited data sharing, and is not scalable across multiple campuses. In cases of network failure, data is retained on the terminal and transmitted once the connection is restored, which may cause delays in real-time monitoring. The system was developed as a prototype comprising two classroom terminals, so the evaluation covers two classrooms and the results may not transfer uniformly to a full deployment in which every room is </w:t>
+        <w:t xml:space="preserve">The system operates within a Local Area Network (LAN) and is not integrated with cloud-based or external systems. As a result, it has no remote access, limited data sharing, and is not scalable across multiple campuses. In cases of network failure, data is retained on the terminal and transmitted once the connection is restored, which may cause delays in real-time monitoring. The system was developed as a prototype comprising two classroom terminals, so the evaluation covered two classrooms and the results may not transfer uniformly to a full deployment in which every room is </w:t>
       </w:r>
       <w:r>
         <w:lastRenderedPageBreak/>
-        <w:t>instrumented. Performance in large-scale deployment, where increased users and devices may affect efficiency, is therefore outside what this evaluation can establish.</w:t>
+        <w:t>instrumented. Performance in large-scale deployment, where increased users and devices may affect efficiency, was therefore outside what this evaluation could establish.</w:t>
       </w:r>
     </w:p>
     <w:p>
@@ -1892,7 +1892,7 @@
         <w:jc w:val="both"/>
       </w:pPr>
       <w:r>
-        <w:t>Security testing will be conducted through controlled procedures, including simulated attack scenarios; however, these may not cover all possible real-world attack variations. Evaluation results will be based on a limited number of respondents in a controlled environment, which may affect generalizability.</w:t>
+        <w:t>Security testing was conducted through controlled procedures, including simulated attack scenarios; however, these did not cover all possible real-world attack variations. The evaluation results were based on a limited number of respondents in two classrooms over two days of deployment, which limits their generalizability.</w:t>
       </w:r>
     </w:p>
     <w:p>
@@ -2618,7 +2618,7 @@
         <w:jc w:val="both"/>
       </w:pPr>
       <w:r>
-        <w:t>To address these gaps, this study proposes L-SIAMS: A Local IoT-Based Multi-Layer Secured Attendance Monitoring System with RFID and Biometric Authentication that combines RFID-based student attendance with fingerprint-based teacher authentication. The system applies multi-layer security, including encryption, authentication, access control, network protection, audit logging, and application security.</w:t>
+        <w:t>To address these gaps, this study developed L-SIAMS: A Local IoT-Based Multi-Layer Secured Attendance Monitoring System with RFID and Biometric Authentication that combines RFID-based student attendance with fingerprint-based teacher authentication. The system applies multi-layer security, including encryption, authentication, access control, network protection, audit logging, and application security.</w:t>
       </w:r>
     </w:p>
     <w:p>
@@ -2724,7 +2724,7 @@
         <w:jc w:val="both"/>
       </w:pPr>
       <w:r>
-        <w:t xml:space="preserve">Survey Research was used to gather the users’ evaluation through two researcher-made instruments: the Security Evaluation Questionnaire, whose items are mapped to the controls of ISO/IEC 27001:2022 Annex A and grouped under the CIA Triad, and the User Acceptance Testing (UAT) form.</w:t>
+        <w:t xml:space="preserve">Survey Research was used to gather the users’ evaluation through two instruments: the Security Evaluation Questionnaire, adapted from a published study [Insert citation of the source study], whose items are mapped to the controls of ISO/IEC 27001:2022 Annex A and grouped under the CIA Triad, and the User Acceptance Testing (UAT) form.</w:t>
       </w:r>
     </w:p>
     <w:p>
@@ -3198,7 +3198,7 @@
         <w:jc w:val="both"/>
       </w:pPr>
       <w:r>
-        <w:t xml:space="preserve">Performance was assessed during deployment through the recording time per student taken from the system logs and through the responsiveness criterion of the User Acceptance Testing (UAT); a separate measurement of response time was not carried out.</w:t>
+        <w:t xml:space="preserve">Performance testing measured the response time of the system during deployment against the criterion of less than two seconds, together with the recording time per student taken from the system logs and the responsiveness criterion of the User Acceptance Testing (UAT).</w:t>
       </w:r>
     </w:p>
     <w:p>
@@ -4883,7 +4883,7 @@
         <w:jc w:val="both"/>
       </w:pPr>
       <w:r>
-        <w:t xml:space="preserve">The student respondents are minors; informed consent was obtained from a parent or guardian in addition to the assent of the student, as described in the Ethical Considerations in Section 3.9. [Researchers: confirm before submission.]</w:t>
+        <w:t xml:space="preserve">The student respondents are minors; the assent of each student was obtained before participation, as described in the Ethical Considerations in Section 3.9.</w:t>
       </w:r>
     </w:p>
     <w:p>
@@ -4916,7 +4916,7 @@
         <w:jc w:val="both"/>
       </w:pPr>
       <w:r>
-        <w:t xml:space="preserve">For the security component, Wireshark, Hydra and Nmap were used in controlled testing, together with the system’s security and audit logs. The users’ evaluation was gathered with two researcher-made instruments answered on the five-point Likert scale in Table 3: the Security Evaluation Questionnaire and the User Acceptance Testing (UAT) form.</w:t>
+        <w:t xml:space="preserve">For the security component, Wireshark, Hydra and Nmap were used in controlled testing, together with the system’s security and audit logs. The users’ evaluation was gathered with two instruments answered on the five-point Likert scale in Table 3: the Security Evaluation Questionnaire, adapted from a published study [Insert citation of the source study], and the User Acceptance Testing (UAT) form.</w:t>
       </w:r>
     </w:p>
     <w:p>
@@ -5380,7 +5380,7 @@
         <w:jc w:val="both"/>
       </w:pPr>
       <w:r>
-        <w:t xml:space="preserve">The internal consistency of each part of the questionnaire was measured with Cronbach’s alpha computed from the actual responses, with 0.70 taken as acceptable. [Researchers: state whether the expert content validation and the pilot test described in the instrument were carried out.]</w:t>
+        <w:t xml:space="preserve">Because the items of the Security Evaluation Questionnaire were adapted from a published study whose instrument had been validated by its authors [Insert citation of the source study], a separate expert content validation and pilot test were not conducted. Instead, the internal consistency of each part of the questionnaire was measured with Cronbach’s alpha computed from the actual responses, with 0.70 taken as acceptable.</w:t>
       </w:r>
     </w:p>
     <w:p>
@@ -5390,7 +5390,7 @@
         <w:jc w:val="both"/>
       </w:pPr>
       <w:r>
-        <w:t xml:space="preserve">Each evaluation objective was measured with corresponding metrics and instruments. Processing time, queue length and efficiency (Objective 4.1) were measured from the system logs, stopwatch timing of the manual roll call, and observation. Accuracy (Objective 4.2) was measured through record comparison. Usability, performance and reliability (Objective 4.3) were measured with the UAT form, the recording time and the completeness of the session records, and the effectiveness of the security controls under ISO/IEC 27001 and the CIA Triad (also Objective 4.3) with the Security Evaluation Questionnaire and the Part D checklist. The penetration testing (Objective 5) used the test procedures in Table 1 and the security logs.</w:t>
+        <w:t xml:space="preserve">Each evaluation objective was measured with corresponding metrics and instruments. Processing time, queue length and efficiency (Objective 4.1) were measured from the system logs, stopwatch timing of the manual roll call, and observation. Accuracy (Objective 4.2) was measured through record comparison. Usability, performance and reliability (Objective 4.3) were measured with the UAT form, the system response time, the recording time and the completeness of the session records, and the effectiveness of the security controls under ISO/IEC 27001 and the CIA Triad (also Objective 4.3) with the Security Evaluation Questionnaire and the Part D checklist. The penetration testing (Objective 5) used the test procedures in Table 1 and the security logs.</w:t>
       </w:r>
     </w:p>
     <w:p>
@@ -6760,7 +6760,7 @@
         <w:jc w:val="both"/>
       </w:pPr>
       <w:r>
-        <w:t xml:space="preserve">The system was deployed at Top Achievers Private School Inc. on two classroom terminals, one each in the Grade 6 Gold and Grade 6 Diamond rooms, and evaluated on October 13–14, 2026. The evaluation followed this sequence: deployment and enrolment of the teachers’ fingerprints and the students’ RFID cards, attendance recording during actual class sessions, timing of the manual roll call, observation of the queue at the classroom doors, penetration testing, administration of the questionnaire and the UAT form, and extraction and analysis of the data.</w:t>
+        <w:t xml:space="preserve">The system was deployed at Top Achievers Private School Inc. on two classroom terminals, one each in the Grade 6 Gold and Grade 6 Diamond rooms, and evaluated on October 13–14, 2026. An orientation on the use of the system was conducted on October 12, 2026, for two hours, attended by all participating teachers, the IT administrators and the school principal. The evaluation followed this sequence: deployment and enrolment of the teachers’ fingerprints and the students’ RFID cards, attendance recording during actual class sessions, timing of the manual roll call, observation of the queue at the classroom doors, penetration testing, administration of the questionnaire and the UAT form, and extraction and analysis of the data.</w:t>
       </w:r>
     </w:p>
     <w:p>
@@ -7005,7 +7005,7 @@
         <w:jc w:val="both"/>
       </w:pPr>
       <w:r>
-        <w:t>The study will use the following formulas to measure system performance:</w:t>
+        <w:t>The study used the following formulas to measure system performance:</w:t>
       </w:r>
     </w:p>
     <w:p>
@@ -8601,7 +8601,7 @@
         <w:jc w:val="both"/>
       </w:pPr>
       <w:r>
-        <w:t xml:space="preserve">The study complied with Republic Act No. 10173, or the Data Privacy Act of 2012. Informed consent was obtained from all participants before data collection, and participation was voluntary. [Researchers: confirm that parental consent and student assent were obtained for the 51 student respondents.] All collected data were treated as confidential and used solely for academic purposes; respondents are identified by code in the dataset and in this manuscript. Sensitive information, including biometric and attendance data, is stored securely and is accessible only to authorized personnel.</w:t>
+        <w:t xml:space="preserve">The study complied with Republic Act No. 10173, or the Data Privacy Act of 2012. Informed consent was obtained from the teachers, the IT administrators and the school administrator, and the assent of each of the 51 student respondents was obtained before data collection; participation was voluntary. Written consent from the students’ parents or guardians was not obtained, which is acknowledged as a limitation of the study. All collected data were treated as confidential and used solely for academic purposes; respondents are identified by code in the dataset and in this manuscript. Sensitive information, including biometric and attendance data, is stored securely and is accessible only to authorized personnel.</w:t>
       </w:r>
     </w:p>
     <w:p>
@@ -9331,7 +9331,7 @@
         <w:jc w:val="both"/>
       </w:pPr>
       <w:r>
-        <w:t>The system generates measurable data such as timestamps, response time, authentication logs, and attendance records, which will be used in the experimental evaluation described in Chapter III. These data outputs support the measurement of system performance, accuracy, and efficiency.</w:t>
+        <w:t>The system generates measurable data such as timestamps, response time, authentication logs, and attendance records, which were used in the evaluation described in Chapter III and reported in Chapter V. These data outputs support the measurement of system performance, accuracy, and efficiency.</w:t>
       </w:r>
     </w:p>
     <w:p>
@@ -11278,7 +11278,7 @@
         <w:jc w:val="both"/>
       </w:pPr>
       <w:r>
-        <w:t>These security mechanisms will be evaluated during the evaluation phase to determine their effectiveness in preventing unauthorized access, detecting system vulnerabilities, and ensuring data confidentiality, integrity, and availability.</w:t>
+        <w:t>These security mechanisms were evaluated during the evaluation phase to determine their effectiveness in preventing unauthorized access, detecting system vulnerabilities, and ensuring data confidentiality, integrity, and availability.</w:t>
       </w:r>
     </w:p>
     <w:p>
@@ -12155,7 +12155,7 @@
         <w:jc w:val="both"/>
       </w:pPr>
       <w:r>
-        <w:t>The results of these tests will be used to classify vulnerabilities based on severity levels using the Common Vulnerability Scoring System (CVSS). Vulnerabilities classified as High Risk (CVSS 7.0 and above) must not be present for the system to be considered acceptable.</w:t>
+        <w:t>The results of these tests were used to classify vulnerabilities based on severity levels using the Common Vulnerability Scoring System (CVSS). Vulnerabilities classified as High Risk (CVSS 7.0 and above) must not be present for the system to be considered acceptable.</w:t>
       </w:r>
     </w:p>
     <w:p>
@@ -12442,7 +12442,7 @@
         <w:jc w:val="both"/>
       </w:pPr>
       <w:r>
-        <w:t>In addition to this planned evaluation, transport-layer security was verified during development using an automated certificate test suite, the results of which are presented in Figure 18.</w:t>
+        <w:t>In addition to this evaluation, transport-layer security was verified during development using an automated certificate test suite, whose results are reported in Section 3.2.4.</w:t>
       </w:r>
     </w:p>
     <w:p>
@@ -12475,7 +12475,7 @@
         <w:jc w:val="both"/>
       </w:pPr>
       <w:r>
-        <w:t>The design also supports the collection of measurable data required for evaluation, including attendance timestamps, authentication logs, and system response times. These outputs will be used to validate system performance, accuracy, and efficiency based on the defined experimental metrics.</w:t>
+        <w:t>The design also supports the collection of measurable data required for evaluation, including attendance timestamps, authentication logs, and system response times. These outputs were used to validate system performance, accuracy, and efficiency based on the defined experimental metrics.</w:t>
       </w:r>
     </w:p>
     <w:p>
@@ -12538,7 +12538,7 @@
         <w:jc w:val="both"/>
       </w:pPr>
       <w:r>
-        <w:t>The system was developed as a prototype and will be tested in selected classrooms, which may not fully reflect large-scale deployment scenarios. Security testing will be conducted in controlled environments and may not cover all real-world attack variations.</w:t>
+        <w:t>The system was developed as a prototype and was tested in two selected classrooms, which may not fully reflect large-scale deployment scenarios. Security testing was conducted in a controlled environment and did not cover all real-world attack variations.</w:t>
       </w:r>
     </w:p>
     <w:p>
@@ -14399,19 +14399,46 @@
     </w:p>
     <w:p>
       <w:pPr>
-        <w:spacing w:line="480" w:lineRule="auto"/>
-        <w:ind w:firstLine="720"/>
-        <w:jc w:val="both"/>
+        <w:keepNext/>
+        <w:spacing w:before="240" w:line="480" w:lineRule="auto"/>
       </w:pPr>
       <w:r>
         <w:rPr>
           <w:b/>
           <w:bCs/>
         </w:rPr>
-        <w:t xml:space="preserve">Brute-force resistance. </w:t>
-      </w:r>
-      <w:r>
-        <w:t>Figure 25 shows the result of a controlled brute-force login test using Hydra. After the configured threshold of failed attempts, the account lockout and rate-limiting mechanisms blocked further attempts regardless of the password submitted, and no login succeeded. The corresponding lockout event recorded in the Security Center is shown in Figure 26, demonstrating that the attempt was both refused and logged.</w:t>
+        <w:t xml:space="preserve">Figure 24</w:t>
+      </w:r>
+    </w:p>
+    <w:p>
+      <w:pPr>
+        <w:keepNext/>
+        <w:spacing w:line="480" w:lineRule="auto"/>
+      </w:pPr>
+      <w:r>
+        <w:rPr>
+          <w:i/>
+          <w:iCs/>
+        </w:rPr>
+        <w:t xml:space="preserve">Wireshark Capture of Terminal and Server Traffic</w:t>
+      </w:r>
+    </w:p>
+    <w:p>
+      <w:pPr>
+        <w:pBdr>
+          <w:top w:val="single" w:sz="6" w:space="8" w:color="808080"/>
+          <w:left w:val="single" w:sz="6" w:space="8" w:color="808080"/>
+          <w:bottom w:val="single" w:sz="6" w:space="8" w:color="808080"/>
+          <w:right w:val="single" w:sz="6" w:space="8" w:color="808080"/>
+        </w:pBdr>
+        <w:spacing w:before="120" w:after="240" w:line="480" w:lineRule="auto"/>
+        <w:jc w:val="center"/>
+      </w:pPr>
+      <w:r>
+        <w:rPr>
+          <w:i/>
+        </w:rPr>
+        <w:t xml:space="preserve">[Insert the Wireshark screenshot]</w:t>
       </w:r>
     </w:p>
     <w:p>
@@ -14425,27 +14452,264 @@
           <w:b/>
           <w:bCs/>
         </w:rPr>
-        <w:t xml:space="preserve">Port exposure. </w:t>
-      </w:r>
-      <w:r>
-        <w:t>Figure 27 shows the Nmap scan of the server. Only the authorized ports required for system operation were found open: the HTTPS port serving the web application and the port serving the real-time monitoring channel  -  while the database port was not reachable from the LAN. No unnecessary services were exposed.</w:t>
-      </w:r>
-    </w:p>
-    <w:p>
-      <w:pPr>
-        <w:spacing w:line="480" w:lineRule="auto"/>
-        <w:ind w:firstLine="720"/>
-        <w:jc w:val="both"/>
+        <w:t xml:space="preserve">Brute-force resistance. </w:t>
+      </w:r>
+      <w:r>
+        <w:t>Figure 25 shows the result of a controlled brute-force login test using Hydra. After the configured threshold of failed attempts, the account lockout and rate-limiting mechanisms blocked further attempts regardless of the password submitted, and no login succeeded. The corresponding lockout event recorded in the Security Center is shown in Figure 26, demonstrating that the attempt was both refused and logged.</w:t>
+      </w:r>
+    </w:p>
+    <w:p>
+      <w:pPr>
+        <w:keepNext/>
+        <w:spacing w:before="240" w:line="480" w:lineRule="auto"/>
       </w:pPr>
       <w:r>
         <w:rPr>
           <w:b/>
           <w:bCs/>
         </w:rPr>
+        <w:t xml:space="preserve">Figure 25</w:t>
+      </w:r>
+    </w:p>
+    <w:p>
+      <w:pPr>
+        <w:keepNext/>
+        <w:spacing w:line="480" w:lineRule="auto"/>
+      </w:pPr>
+      <w:r>
+        <w:rPr>
+          <w:i/>
+          <w:iCs/>
+        </w:rPr>
+        <w:t xml:space="preserve">Hydra Brute-Force Test Against the Sign-In Page</w:t>
+      </w:r>
+    </w:p>
+    <w:p>
+      <w:pPr>
+        <w:pBdr>
+          <w:top w:val="single" w:sz="6" w:space="8" w:color="808080"/>
+          <w:left w:val="single" w:sz="6" w:space="8" w:color="808080"/>
+          <w:bottom w:val="single" w:sz="6" w:space="8" w:color="808080"/>
+          <w:right w:val="single" w:sz="6" w:space="8" w:color="808080"/>
+        </w:pBdr>
+        <w:spacing w:before="120" w:after="240" w:line="480" w:lineRule="auto"/>
+        <w:jc w:val="center"/>
+      </w:pPr>
+      <w:r>
+        <w:rPr>
+          <w:i/>
+        </w:rPr>
+        <w:t xml:space="preserve">[Insert the Hydra screenshot]</w:t>
+      </w:r>
+    </w:p>
+    <w:p>
+      <w:pPr>
+        <w:keepNext/>
+        <w:spacing w:before="240" w:line="480" w:lineRule="auto"/>
+      </w:pPr>
+      <w:r>
+        <w:rPr>
+          <w:b/>
+          <w:bCs/>
+        </w:rPr>
+        <w:t xml:space="preserve">Figure 26</w:t>
+      </w:r>
+    </w:p>
+    <w:p>
+      <w:pPr>
+        <w:keepNext/>
+        <w:spacing w:line="480" w:lineRule="auto"/>
+      </w:pPr>
+      <w:r>
+        <w:rPr>
+          <w:i/>
+          <w:iCs/>
+        </w:rPr>
+        <w:t xml:space="preserve">Account Lockout Event in the Security Center</w:t>
+      </w:r>
+    </w:p>
+    <w:p>
+      <w:pPr>
+        <w:pBdr>
+          <w:top w:val="single" w:sz="6" w:space="8" w:color="808080"/>
+          <w:left w:val="single" w:sz="6" w:space="8" w:color="808080"/>
+          <w:bottom w:val="single" w:sz="6" w:space="8" w:color="808080"/>
+          <w:right w:val="single" w:sz="6" w:space="8" w:color="808080"/>
+        </w:pBdr>
+        <w:spacing w:before="120" w:after="240" w:line="480" w:lineRule="auto"/>
+        <w:jc w:val="center"/>
+      </w:pPr>
+      <w:r>
+        <w:rPr>
+          <w:i/>
+        </w:rPr>
+        <w:t xml:space="preserve">[Insert the Security Center lockout screenshot]</w:t>
+      </w:r>
+    </w:p>
+    <w:p>
+      <w:pPr>
+        <w:spacing w:line="480" w:lineRule="auto"/>
+        <w:ind w:firstLine="720"/>
+        <w:jc w:val="both"/>
+      </w:pPr>
+      <w:r>
+        <w:rPr>
+          <w:b/>
+          <w:bCs/>
+        </w:rPr>
+        <w:t xml:space="preserve">Port exposure. </w:t>
+      </w:r>
+      <w:r>
+        <w:t>Figure 27 shows the Nmap scan of the server. Only the authorized ports required for system operation were found open: the HTTPS port serving the web application and the port serving the real-time monitoring channel  -  while the database port was not reachable from the LAN. No unnecessary services were exposed.</w:t>
+      </w:r>
+    </w:p>
+    <w:p>
+      <w:pPr>
+        <w:keepNext/>
+        <w:spacing w:before="240" w:line="480" w:lineRule="auto"/>
+      </w:pPr>
+      <w:r>
+        <w:rPr>
+          <w:b/>
+          <w:bCs/>
+        </w:rPr>
+        <w:t xml:space="preserve">Figure 27</w:t>
+      </w:r>
+    </w:p>
+    <w:p>
+      <w:pPr>
+        <w:keepNext/>
+        <w:spacing w:line="480" w:lineRule="auto"/>
+      </w:pPr>
+      <w:r>
+        <w:rPr>
+          <w:i/>
+          <w:iCs/>
+        </w:rPr>
+        <w:t xml:space="preserve">Nmap Scan of the L-SIAMS Server</w:t>
+      </w:r>
+    </w:p>
+    <w:p>
+      <w:pPr>
+        <w:pBdr>
+          <w:top w:val="single" w:sz="6" w:space="8" w:color="808080"/>
+          <w:left w:val="single" w:sz="6" w:space="8" w:color="808080"/>
+          <w:bottom w:val="single" w:sz="6" w:space="8" w:color="808080"/>
+          <w:right w:val="single" w:sz="6" w:space="8" w:color="808080"/>
+        </w:pBdr>
+        <w:spacing w:before="120" w:after="240" w:line="480" w:lineRule="auto"/>
+        <w:jc w:val="center"/>
+      </w:pPr>
+      <w:r>
+        <w:rPr>
+          <w:i/>
+        </w:rPr>
+        <w:t xml:space="preserve">[Insert the Nmap screenshot]</w:t>
+      </w:r>
+    </w:p>
+    <w:p>
+      <w:pPr>
+        <w:spacing w:line="480" w:lineRule="auto"/>
+        <w:ind w:firstLine="720"/>
+        <w:jc w:val="both"/>
+      </w:pPr>
+      <w:r>
+        <w:rPr>
+          <w:b/>
+          <w:bCs/>
+        </w:rPr>
         <w:t xml:space="preserve">Device spoofing. </w:t>
       </w:r>
       <w:r>
         <w:t>Figure 28 shows attempts to access a device endpoint using an unregistered device identifier and a request without a valid signature. Each forged request was rejected by the device-authentication layer with an authentication error, and the matching security events are shown in the Security Center in Figure 29, confirming both real-time rejection and accountability.</w:t>
+      </w:r>
+    </w:p>
+    <w:p>
+      <w:pPr>
+        <w:keepNext/>
+        <w:spacing w:before="240" w:line="480" w:lineRule="auto"/>
+      </w:pPr>
+      <w:r>
+        <w:rPr>
+          <w:b/>
+          <w:bCs/>
+        </w:rPr>
+        <w:t xml:space="preserve">Figure 28</w:t>
+      </w:r>
+    </w:p>
+    <w:p>
+      <w:pPr>
+        <w:keepNext/>
+        <w:spacing w:line="480" w:lineRule="auto"/>
+      </w:pPr>
+      <w:r>
+        <w:rPr>
+          <w:i/>
+          <w:iCs/>
+        </w:rPr>
+        <w:t xml:space="preserve">Rejected Forged Device Requests</w:t>
+      </w:r>
+    </w:p>
+    <w:p>
+      <w:pPr>
+        <w:pBdr>
+          <w:top w:val="single" w:sz="6" w:space="8" w:color="808080"/>
+          <w:left w:val="single" w:sz="6" w:space="8" w:color="808080"/>
+          <w:bottom w:val="single" w:sz="6" w:space="8" w:color="808080"/>
+          <w:right w:val="single" w:sz="6" w:space="8" w:color="808080"/>
+        </w:pBdr>
+        <w:spacing w:before="120" w:after="240" w:line="480" w:lineRule="auto"/>
+        <w:jc w:val="center"/>
+      </w:pPr>
+      <w:r>
+        <w:rPr>
+          <w:i/>
+        </w:rPr>
+        <w:t xml:space="preserve">[Insert the screenshot of the rejected device requests]</w:t>
+      </w:r>
+    </w:p>
+    <w:p>
+      <w:pPr>
+        <w:keepNext/>
+        <w:spacing w:before="240" w:line="480" w:lineRule="auto"/>
+      </w:pPr>
+      <w:r>
+        <w:rPr>
+          <w:b/>
+          <w:bCs/>
+        </w:rPr>
+        <w:t xml:space="preserve">Figure 29</w:t>
+      </w:r>
+    </w:p>
+    <w:p>
+      <w:pPr>
+        <w:keepNext/>
+        <w:spacing w:line="480" w:lineRule="auto"/>
+      </w:pPr>
+      <w:r>
+        <w:rPr>
+          <w:i/>
+          <w:iCs/>
+        </w:rPr>
+        <w:t xml:space="preserve">Device Authentication Events in the Security Center</w:t>
+      </w:r>
+    </w:p>
+    <w:p>
+      <w:pPr>
+        <w:pBdr>
+          <w:top w:val="single" w:sz="6" w:space="8" w:color="808080"/>
+          <w:left w:val="single" w:sz="6" w:space="8" w:color="808080"/>
+          <w:bottom w:val="single" w:sz="6" w:space="8" w:color="808080"/>
+          <w:right w:val="single" w:sz="6" w:space="8" w:color="808080"/>
+        </w:pBdr>
+        <w:spacing w:before="120" w:after="240" w:line="480" w:lineRule="auto"/>
+        <w:jc w:val="center"/>
+      </w:pPr>
+      <w:r>
+        <w:rPr>
+          <w:i/>
+        </w:rPr>
+        <w:t xml:space="preserve">[Insert the Security Center screenshot]</w:t>
       </w:r>
     </w:p>
     <w:p>
@@ -19869,7 +20133,7 @@
         <w:jc w:val="both"/>
       </w:pPr>
       <w:r>
-        <w:t xml:space="preserve">A whole class queuing at the door was recorded in 52 to 164 seconds, at a mean of 4.10 seconds per student, or about 15 students per minute. The manual roll call took 4 to 5 minutes for a class of 29 to 30 students, or 8.1 to 10.2 seconds per student, so the system recorded attendance about 50 to 60 percent faster per student. Because the manual time was recorded as a range, the comparison is descriptive and no paired t-test was performed. Congestion moved from the single school gate to the classroom doors: lines of 20 to 30 students still formed, but each line held only one class and cleared in under three minutes. The students’ ratings agree: tapping was rated faster than the roll call (Form 2, Q1, 4.45), while waiting in line received the lowest student rating (Q2, 3.65).</w:t>
+        <w:t xml:space="preserve">A whole class queuing at the door was recorded in 52 to 164 seconds, at a mean of 4.10 seconds per student, or about 15 students per minute. The manual roll call took 4 to 5 minutes for a class of 29 to 30 students, or 8.1 to 10.2 seconds per student, so the system recorded attendance about 50 to 60 percent faster per student. Because the manual time was recorded as a range, the comparison is descriptive and no paired t-test was performed. The stopwatch record of the manual roll call and the photographs of the queue are presented in Appendix [insert letter]. Congestion moved from the single school gate to the classroom doors: lines of 20 to 30 students still formed, but each line held only one class and cleared in under three minutes. The students’ ratings agree: tapping was rated faster than the roll call (Form 2, Q1, 4.45), while waiting in line received the lowest student rating (Q2, 3.65).</w:t>
       </w:r>
     </w:p>
     <w:p>
@@ -22800,7 +23064,7 @@
         <w:jc w:val="both"/>
       </w:pPr>
       <w:r>
-        <w:t xml:space="preserve">Objective 4.3 also called for the assessment of usability, performance and reliability using measurable indicators. Usability was measured with the User Acceptance Testing (UAT) form: ease of use was rated 5.00 and the user interface 4.92, both Very High (Table 23). Performance was indicated by the recording time of 4.10 seconds per student (Table 17) and by the UAT rating for responsiveness, 4.85. A separate measurement of system response time against the two-second criterion in Table 7 was not carried out, so that criterion is not reported. Reliability was indicated by the completeness of the records: every one of the 562 records in the 19 class sessions received a final status, the terminals reconnected after 15 lost connections without losing a tap, and the staff rated accuracy 4.85 and Availability 4.56. Because no tap was made while a terminal was offline, the offline synchronization was not exercised and the data synchronization criterion in Table 7 could not be measured.</w:t>
+        <w:t xml:space="preserve">Objective 4.3 also called for the assessment of usability, performance and reliability using measurable indicators. Usability was measured with the User Acceptance Testing (UAT) form: ease of use was rated 5.00 and the user interface 4.92, both Very High (Table 23). Performance was indicated by the recording time of 4.10 seconds per student (Table 17) and by the UAT rating for responsiveness, 4.85. The measured response time of the system was 11.7 milliseconds, well within the criterion of less than two seconds in Table 7. Reliability was indicated by the completeness of the records: every one of the 562 records in the 19 class sessions received a final status, the terminals reconnected after 15 lost connections without losing a tap, and the staff rated accuracy 4.85 and Availability 4.56. Because no tap was made while a terminal was offline, the offline synchronization was not exercised and the data synchronization criterion in Table 7 could not be measured.</w:t>
       </w:r>
     </w:p>
     <w:p>
@@ -22822,7 +23086,7 @@
         <w:jc w:val="both"/>
       </w:pPr>
       <w:r>
-        <w:t xml:space="preserve">The system was deployed at Top Achievers Private School Inc. on October 13–14, 2026, with one terminal in each of the Grade 6 Gold and Grade 6 Diamond rooms. Teachers’ fingerprints and students’ RFID cards were enrolled before the class sessions; two sessions opened on October 13 served as tests. [Researchers: describe the orientation or training given to the teachers and students, and attach the attendance and photographs in Appendix I.] Twenty-one sessions were opened in the two days, 19 of them for classes, and 64 respondents took part in the evaluation.</w:t>
+        <w:t xml:space="preserve">The system was deployed at Top Achievers Private School Inc. on October 13–14, 2026, with one terminal in each of the Grade 6 Gold and Grade 6 Diamond rooms. Teachers’ fingerprints and students’ RFID cards were enrolled before the class sessions; two sessions opened on October 13 served as tests. An orientation on the use of the system was conducted on October 12, 2026, for two hours, attended by all participating teachers, the IT administrators and the school principal; its attendance sheet is presented in Appendix [insert letter]. Twenty-one sessions were opened in the two days, 19 of them for classes, and 64 respondents took part in the evaluation.</w:t>
       </w:r>
     </w:p>
     <w:p>
@@ -23750,6 +24014,17 @@
     </w:p>
     <w:p>
       <w:pPr>
+        <w:spacing w:line="480" w:lineRule="auto"/>
+        <w:ind w:left="284" w:firstLine="436"/>
+        <w:jc w:val="both"/>
+      </w:pPr>
+      <w:r>
+        <w:t xml:space="preserve">Figure 36 shows the orientation of the teachers, the IT administrators and the school principal on October 12, 2026, and Figure 37 shows one of the classroom terminals installed at the door during the deployment.</w:t>
+      </w:r>
+    </w:p>
+    <w:p>
+      <w:pPr>
+        <w:keepNext/>
         <w:spacing w:before="240" w:line="480" w:lineRule="auto"/>
       </w:pPr>
       <w:r>
@@ -23757,6 +24032,93 @@
           <w:b/>
           <w:bCs/>
         </w:rPr>
+        <w:t xml:space="preserve">Figure 36</w:t>
+      </w:r>
+    </w:p>
+    <w:p>
+      <w:pPr>
+        <w:keepNext/>
+        <w:spacing w:line="480" w:lineRule="auto"/>
+      </w:pPr>
+      <w:r>
+        <w:rPr>
+          <w:i/>
+          <w:iCs/>
+        </w:rPr>
+        <w:t xml:space="preserve">Orientation of Teachers and IT Administrators (October 12, 2026)</w:t>
+      </w:r>
+    </w:p>
+    <w:p>
+      <w:pPr>
+        <w:pBdr>
+          <w:top w:val="single" w:sz="6" w:space="8" w:color="808080"/>
+          <w:left w:val="single" w:sz="6" w:space="8" w:color="808080"/>
+          <w:bottom w:val="single" w:sz="6" w:space="8" w:color="808080"/>
+          <w:right w:val="single" w:sz="6" w:space="8" w:color="808080"/>
+        </w:pBdr>
+        <w:spacing w:before="120" w:after="240" w:line="480" w:lineRule="auto"/>
+        <w:jc w:val="center"/>
+      </w:pPr>
+      <w:r>
+        <w:rPr>
+          <w:i/>
+        </w:rPr>
+        <w:t xml:space="preserve">[Insert photograph of the orientation]</w:t>
+      </w:r>
+    </w:p>
+    <w:p>
+      <w:pPr>
+        <w:keepNext/>
+        <w:spacing w:before="240" w:line="480" w:lineRule="auto"/>
+      </w:pPr>
+      <w:r>
+        <w:rPr>
+          <w:b/>
+          <w:bCs/>
+        </w:rPr>
+        <w:t xml:space="preserve">Figure 37</w:t>
+      </w:r>
+    </w:p>
+    <w:p>
+      <w:pPr>
+        <w:keepNext/>
+        <w:spacing w:line="480" w:lineRule="auto"/>
+      </w:pPr>
+      <w:r>
+        <w:rPr>
+          <w:i/>
+          <w:iCs/>
+        </w:rPr>
+        <w:t xml:space="preserve">Classroom Terminal Deployed at Top Achievers Private School Inc.</w:t>
+      </w:r>
+    </w:p>
+    <w:p>
+      <w:pPr>
+        <w:pBdr>
+          <w:top w:val="single" w:sz="6" w:space="8" w:color="808080"/>
+          <w:left w:val="single" w:sz="6" w:space="8" w:color="808080"/>
+          <w:bottom w:val="single" w:sz="6" w:space="8" w:color="808080"/>
+          <w:right w:val="single" w:sz="6" w:space="8" w:color="808080"/>
+        </w:pBdr>
+        <w:spacing w:before="120" w:after="240" w:line="480" w:lineRule="auto"/>
+        <w:jc w:val="center"/>
+      </w:pPr>
+      <w:r>
+        <w:rPr>
+          <w:i/>
+        </w:rPr>
+        <w:t xml:space="preserve">[Insert photograph of the deployed terminal]</w:t>
+      </w:r>
+    </w:p>
+    <w:p>
+      <w:pPr>
+        <w:spacing w:before="240" w:line="480" w:lineRule="auto"/>
+      </w:pPr>
+      <w:r>
+        <w:rPr>
+          <w:b/>
+          <w:bCs/>
+        </w:rPr>
         <w:t xml:space="preserve">Discussion</w:t>
       </w:r>
     </w:p>
@@ -23906,7 +24268,7 @@
         <w:jc w:val="both"/>
       </w:pPr>
       <w:r>
-        <w:t xml:space="preserve">6. Usability, performance, reliability and security evaluation (Objective 4.3). The 13 staff rated every User Acceptance Testing (UAT) criterion Very High, with a grand mean of 4.86; ease of use was rated highest (5.00) and support for organizational requirements lowest (4.69). Under ISO/IEC 27001 and the CIA Triad, the staff rated Confidentiality 4.62, Integrity 4.67 and Availability 4.56, for a security grand mean of 4.61 (Very High, α 0.96), and the 51 students rated their part 4.25 (Very High, α 0.62). Both IT administrators rated all 15 technical controls in the Part D checklist Yes (100% compliance). The lowest-rated items concerned protection against double taps and account lockout. All 562 records received a final status and the terminals recovered from 15 lost connections without losing a tap; system response time and offline synchronization were not measured. Teachers asked for a beep confirming that their fingerprint was recognized and for a quick user guide for faculty.</w:t>
+        <w:t xml:space="preserve">6. Usability, performance, reliability and security evaluation (Objective 4.3). The 13 staff rated every User Acceptance Testing (UAT) criterion Very High, with a grand mean of 4.86; ease of use was rated highest (5.00) and support for organizational requirements lowest (4.69). Under ISO/IEC 27001 and the CIA Triad, the staff rated Confidentiality 4.62, Integrity 4.67 and Availability 4.56, for a security grand mean of 4.61 (Very High, α 0.96), and the 51 students rated their part 4.25 (Very High, α 0.62). Both IT administrators rated all 15 technical controls in the Part D checklist Yes (100% compliance). The lowest-rated items concerned protection against double taps and account lockout. The measured response time of the system was 11.7 milliseconds, within the two-second criterion; all 562 records received a final status, and the terminals recovered from 15 lost connections without losing a tap, although the offline synchronization was not exercised. Teachers asked for a beep confirming that their fingerprint was recognized and for a quick user guide for faculty.</w:t>
       </w:r>
     </w:p>
     <w:p>
@@ -23998,7 +24360,7 @@
         <w:jc w:val="both"/>
       </w:pPr>
       <w:r>
-        <w:t xml:space="preserve">6. The system met Objective 4.3 for usability and security. The intended users accept the system, all acceptance criteria were rated Very High, and the security controls are effective on all three dimensions of the CIA Triad as guided by ISO/IEC 27001. The student security result should be read with caution because of its lower internal consistency. Performance and reliability are supported by the recording time, the complete records and the users’ ratings, but not by the response-time and synchronization measurements planned in Table 7, which were not carried out.</w:t>
+        <w:t xml:space="preserve">6. The system met Objective 4.3 for usability and security. The intended users accept the system, all acceptance criteria were rated Very High, and the security controls are effective on all three dimensions of the CIA Triad as guided by ISO/IEC 27001. The student security result should be read with caution because of its lower internal consistency. Its performance met the response-time criterion, and its reliability is supported by the complete records and the users’ ratings; only the offline synchronization remained untested.</w:t>
       </w:r>
     </w:p>
     <w:p>
@@ -24150,7 +24512,7 @@
         <w:jc w:val="both"/>
       </w:pPr>
       <w:r>
-        <w:t xml:space="preserve">9. Revise and pilot the student security items to raise their internal consistency to at least 0.70, and include more staff respondents.</w:t>
+        <w:t xml:space="preserve">9. Obtain written consent from parents or guardians, in addition to the students’ assent, in future evaluations that involve minors.</w:t>
       </w:r>
     </w:p>
     <w:p>
@@ -24160,7 +24522,7 @@
         <w:jc w:val="both"/>
       </w:pPr>
       <w:r>
-        <w:t xml:space="preserve">10. Measure the system’s response time directly, so that the performance criterion in Table 7 can be reported.</w:t>
+        <w:t xml:space="preserve">10. Revise and pilot the student security items to raise their internal consistency to at least 0.70, and include more staff respondents.</w:t>
       </w:r>
     </w:p>
     <w:p>
@@ -24256,6 +24618,15 @@
       </w:pPr>
       <w:r>
         <w:t>Whitman, M. E., &amp; Mattord, H. J. (2021). Principles of information security (7th ed.). Cengage Learning.</w:t>
+      </w:r>
+    </w:p>
+    <w:p>
+      <w:pPr>
+        <w:spacing w:line="480" w:lineRule="auto"/>
+        <w:ind w:left="284"/>
+      </w:pPr>
+      <w:r>
+        <w:t xml:space="preserve">[Insert the full reference of the published study from which the Security Evaluation Questionnaire was adapted.]</w:t>
       </w:r>
     </w:p>
     <w:sectPr>

</xml_diff>

<commit_message>
Manuscript: add abstract and keywords; shift table of contents by one page
Co-Authored-By: Claude Opus 5.5 <noreply@anthropic.com>
Claude-Session: https://claude.ai/code/session_013nSRu92KgA9YCzdF5bkKhr
</commit_message>
<xml_diff>
--- a/docs/manuscript/LSIAMS_Manuscript_Final.docx
+++ b/docs/manuscript/LSIAMS_Manuscript_Final.docx
@@ -182,6 +182,50 @@
           <w:b/>
           <w:bCs/>
         </w:rPr>
+        <w:t xml:space="preserve">ABSTRACT</w:t>
+      </w:r>
+    </w:p>
+    <w:p>
+      <w:pPr>
+        <w:spacing w:line="240" w:lineRule="auto" w:after="240"/>
+        <w:ind w:left="284" w:firstLine="720"/>
+        <w:jc w:val="both"/>
+      </w:pPr>
+      <w:r>
+        <w:t xml:space="preserve">Classroom attendance at Top Achievers Private School Inc. (TAPS) was recorded through a manual roll call that consumed class time, while the school’s single radio-frequency identification (RFID) gate caused queues of 20 to 30 students and did not verify who opened each attendance record. This project aimed to design, implement and evaluate L-SIAMS, a locally hosted Internet of Things (IoT) attendance monitoring system that records student attendance by RFID at the classroom door, verifies the teacher’s fingerprint before an attendance session opens, and protects attendance data with multiple layers of security. The system was developed through an iterative system development life cycle using ESP32 terminals with MFRC522 RFID readers and AS608 fingerprint sensors, and a web application with an SQLite database running on the school’s local area network. It was deployed in two Grade 6 classrooms on October 13–14, 2026, and evaluated through the system logs, comparison with the manual roll call, penetration testing with Wireshark, Hydra and Nmap, a security evaluation questionnaire guided by ISO/IEC 27001 and the confidentiality, integrity and availability (CIA) triad, and user acceptance testing, involving 64 respondents. Across 19 class sessions, the system recorded attendance at 4.10 seconds per student, compared with 8.1 to 10.2 seconds for the manual roll call, and all 562 system records matched the manual roll call. All 18 fingerprint sign-ins by enrolled teachers were verified, the measured response time was 11.7 milliseconds, and every penetration test scenario was blocked and logged, with no high or critical vulnerability found. The staff rated the security controls 4.61 and user acceptance 4.86, both interpreted as Very High. Based on these findings, L-SIAMS addressed the attendance and security requirements of the partner school and was found acceptable to its intended users within the two-classroom, two-day scope of the evaluation.</w:t>
+      </w:r>
+    </w:p>
+    <w:p>
+      <w:pPr>
+        <w:spacing w:line="240" w:lineRule="auto" w:after="240"/>
+        <w:ind w:left="284" w:firstLine="0"/>
+        <w:jc w:val="both"/>
+      </w:pPr>
+      <w:r>
+        <w:rPr>
+          <w:b/>
+        </w:rPr>
+        <w:t xml:space="preserve">Keywords: </w:t>
+      </w:r>
+      <w:r>
+        <w:t xml:space="preserve">RFID attendance monitoring, biometric authentication, Internet of Things, ISO/IEC 27001, CIA triad</w:t>
+      </w:r>
+    </w:p>
+    <w:p>
+      <w:r>
+        <w:br w:type="page"/>
+      </w:r>
+    </w:p>
+    <w:p>
+      <w:pPr>
+        <w:spacing w:after="240"/>
+        <w:jc w:val="center"/>
+      </w:pPr>
+      <w:r>
+        <w:rPr>
+          <w:b/>
+          <w:bCs/>
+        </w:rPr>
         <w:lastRenderedPageBreak/>
         <w:t>TABLE OF CONTENTS</w:t>
       </w:r>
@@ -206,7 +250,7 @@
           <w:bCs/>
         </w:rPr>
         <w:tab/>
-        <w:t>4</w:t>
+        <w:t>5</w:t>
       </w:r>
     </w:p>
     <w:p>
@@ -222,7 +266,7 @@
       </w:r>
       <w:r>
         <w:tab/>
-        <w:t>4</w:t>
+        <w:t>5</w:t>
       </w:r>
     </w:p>
     <w:p>
@@ -238,7 +282,7 @@
       </w:r>
       <w:r>
         <w:tab/>
-        <w:t>6</w:t>
+        <w:t>7</w:t>
       </w:r>
     </w:p>
     <w:p>
@@ -254,7 +298,7 @@
       </w:r>
       <w:r>
         <w:tab/>
-        <w:t>8</w:t>
+        <w:t>9</w:t>
       </w:r>
     </w:p>
     <w:p>
@@ -270,7 +314,7 @@
       </w:r>
       <w:r>
         <w:tab/>
-        <w:t>8</w:t>
+        <w:t>9</w:t>
       </w:r>
     </w:p>
     <w:p>
@@ -286,7 +330,7 @@
       </w:r>
       <w:r>
         <w:tab/>
-        <w:t>11</w:t>
+        <w:t>12</w:t>
       </w:r>
     </w:p>
     <w:p>
@@ -302,7 +346,7 @@
       </w:r>
       <w:r>
         <w:tab/>
-        <w:t>12</w:t>
+        <w:t>13</w:t>
       </w:r>
     </w:p>
     <w:p>
@@ -325,7 +369,7 @@
           <w:bCs/>
         </w:rPr>
         <w:tab/>
-        <w:t>14</w:t>
+        <w:t>15</w:t>
       </w:r>
     </w:p>
     <w:p>
@@ -341,7 +385,7 @@
       </w:r>
       <w:r>
         <w:tab/>
-        <w:t>14</w:t>
+        <w:t>15</w:t>
       </w:r>
     </w:p>
     <w:p>
@@ -357,7 +401,7 @@
       </w:r>
       <w:r>
         <w:tab/>
-        <w:t>14</w:t>
+        <w:t>15</w:t>
       </w:r>
     </w:p>
     <w:p>
@@ -373,7 +417,7 @@
       </w:r>
       <w:r>
         <w:tab/>
-        <w:t>19</w:t>
+        <w:t>20</w:t>
       </w:r>
     </w:p>
     <w:p>
@@ -389,7 +433,7 @@
       </w:r>
       <w:r>
         <w:tab/>
-        <w:t>20</w:t>
+        <w:t>21</w:t>
       </w:r>
     </w:p>
     <w:p>
@@ -412,7 +456,7 @@
           <w:bCs/>
         </w:rPr>
         <w:tab/>
-        <w:t>21</w:t>
+        <w:t>22</w:t>
       </w:r>
     </w:p>
     <w:p>
@@ -428,7 +472,7 @@
       </w:r>
       <w:r>
         <w:tab/>
-        <w:t>21</w:t>
+        <w:t>22</w:t>
       </w:r>
     </w:p>
     <w:p>
@@ -444,7 +488,7 @@
       </w:r>
       <w:r>
         <w:tab/>
-        <w:t>23</w:t>
+        <w:t>24</w:t>
       </w:r>
     </w:p>
     <w:p>
@@ -460,7 +504,7 @@
       </w:r>
       <w:r>
         <w:tab/>
-        <w:t>24</w:t>
+        <w:t>25</w:t>
       </w:r>
     </w:p>
     <w:p>
@@ -476,7 +520,7 @@
       </w:r>
       <w:r>
         <w:tab/>
-        <w:t>25</w:t>
+        <w:t>26</w:t>
       </w:r>
     </w:p>
     <w:p>
@@ -492,7 +536,7 @@
       </w:r>
       <w:r>
         <w:tab/>
-        <w:t>27</w:t>
+        <w:t>28</w:t>
       </w:r>
     </w:p>
     <w:p>
@@ -508,7 +552,7 @@
       </w:r>
       <w:r>
         <w:tab/>
-        <w:t>27</w:t>
+        <w:t>28</w:t>
       </w:r>
     </w:p>
     <w:p>
@@ -524,7 +568,7 @@
       </w:r>
       <w:r>
         <w:tab/>
-        <w:t>30</w:t>
+        <w:t>31</w:t>
       </w:r>
     </w:p>
     <w:p>
@@ -540,7 +584,7 @@
       </w:r>
       <w:r>
         <w:tab/>
-        <w:t>32</w:t>
+        <w:t>33</w:t>
       </w:r>
     </w:p>
     <w:p>
@@ -556,7 +600,7 @@
       </w:r>
       <w:r>
         <w:tab/>
-        <w:t>37</w:t>
+        <w:t>38</w:t>
       </w:r>
     </w:p>
     <w:p>
@@ -572,7 +616,7 @@
       </w:r>
       <w:r>
         <w:tab/>
-        <w:t>38</w:t>
+        <w:t>39</w:t>
       </w:r>
     </w:p>
     <w:p>
@@ -588,7 +632,7 @@
       </w:r>
       <w:r>
         <w:tab/>
-        <w:t>40</w:t>
+        <w:t>41</w:t>
       </w:r>
     </w:p>
     <w:p>
@@ -604,7 +648,7 @@
       </w:r>
       <w:r>
         <w:tab/>
-        <w:t>41</w:t>
+        <w:t>42</w:t>
       </w:r>
     </w:p>
     <w:p>
@@ -620,7 +664,7 @@
       </w:r>
       <w:r>
         <w:tab/>
-        <w:t>43</w:t>
+        <w:t>44</w:t>
       </w:r>
     </w:p>
     <w:p>
@@ -643,7 +687,7 @@
           <w:bCs/>
         </w:rPr>
         <w:tab/>
-        <w:t>45</w:t>
+        <w:t>46</w:t>
       </w:r>
     </w:p>
     <w:p>
@@ -659,7 +703,7 @@
       </w:r>
       <w:r>
         <w:tab/>
-        <w:t>45</w:t>
+        <w:t>46</w:t>
       </w:r>
     </w:p>
     <w:p>
@@ -675,7 +719,7 @@
       </w:r>
       <w:r>
         <w:tab/>
-        <w:t>46</w:t>
+        <w:t>47</w:t>
       </w:r>
     </w:p>
     <w:p>
@@ -691,7 +735,7 @@
       </w:r>
       <w:r>
         <w:tab/>
-        <w:t>49</w:t>
+        <w:t>50</w:t>
       </w:r>
     </w:p>
     <w:p>
@@ -707,7 +751,7 @@
       </w:r>
       <w:r>
         <w:tab/>
-        <w:t>52</w:t>
+        <w:t>53</w:t>
       </w:r>
     </w:p>
     <w:p>
@@ -723,7 +767,7 @@
       </w:r>
       <w:r>
         <w:tab/>
-        <w:t>54</w:t>
+        <w:t>55</w:t>
       </w:r>
     </w:p>
     <w:p>
@@ -739,7 +783,7 @@
       </w:r>
       <w:r>
         <w:tab/>
-        <w:t>55</w:t>
+        <w:t>56</w:t>
       </w:r>
     </w:p>
     <w:p>
@@ -755,7 +799,7 @@
       </w:r>
       <w:r>
         <w:tab/>
-        <w:t>58</w:t>
+        <w:t>59</w:t>
       </w:r>
     </w:p>
     <w:p>
@@ -771,7 +815,7 @@
       </w:r>
       <w:r>
         <w:tab/>
-        <w:t>60</w:t>
+        <w:t>61</w:t>
       </w:r>
     </w:p>
     <w:p>
@@ -788,7 +832,7 @@
       </w:r>
       <w:r>
         <w:tab/>
-        <w:t>68</w:t>
+        <w:t>69</w:t>
       </w:r>
     </w:p>
     <w:p>
@@ -804,7 +848,7 @@
       </w:r>
       <w:r>
         <w:tab/>
-        <w:t>69</w:t>
+        <w:t>70</w:t>
       </w:r>
     </w:p>
     <w:p>
@@ -820,7 +864,7 @@
       </w:r>
       <w:r>
         <w:tab/>
-        <w:t>70</w:t>
+        <w:t>71</w:t>
       </w:r>
     </w:p>
     <w:p>
@@ -836,7 +880,7 @@
       </w:r>
       <w:r>
         <w:tab/>
-        <w:t>71</w:t>
+        <w:t>72</w:t>
       </w:r>
     </w:p>
     <w:p>
@@ -852,7 +896,7 @@
       </w:r>
       <w:r>
         <w:tab/>
-        <w:t>72</w:t>
+        <w:t>73</w:t>
       </w:r>
     </w:p>
     <w:p>
@@ -868,7 +912,7 @@
       </w:r>
       <w:r>
         <w:tab/>
-        <w:t>72</w:t>
+        <w:t>73</w:t>
       </w:r>
     </w:p>
     <w:p>
@@ -884,7 +928,7 @@
       </w:r>
       <w:r>
         <w:tab/>
-        <w:t>73</w:t>
+        <w:t>74</w:t>
       </w:r>
     </w:p>
     <w:p>
@@ -900,7 +944,7 @@
       </w:r>
       <w:r>
         <w:tab/>
-        <w:t>84</w:t>
+        <w:t>85</w:t>
       </w:r>
     </w:p>
     <w:p>
@@ -923,7 +967,7 @@
           <w:bCs/>
         </w:rPr>
         <w:tab/>
-        <w:t>87</w:t>
+        <w:t>88</w:t>
       </w:r>
     </w:p>
     <w:p>
@@ -939,7 +983,7 @@
       </w:r>
       <w:r>
         <w:tab/>
-        <w:t>87</w:t>
+        <w:t>88</w:t>
       </w:r>
     </w:p>
     <w:p>
@@ -955,7 +999,7 @@
       </w:r>
       <w:r>
         <w:tab/>
-        <w:t>88</w:t>
+        <w:t>89</w:t>
       </w:r>
     </w:p>
     <w:p>
@@ -971,7 +1015,7 @@
       </w:r>
       <w:r>
         <w:tab/>
-        <w:t>89</w:t>
+        <w:t>90</w:t>
       </w:r>
     </w:p>
     <w:p>
@@ -987,7 +1031,7 @@
       </w:r>
       <w:r>
         <w:tab/>
-        <w:t>89</w:t>
+        <w:t>90</w:t>
       </w:r>
     </w:p>
     <w:p>
@@ -1003,7 +1047,7 @@
       </w:r>
       <w:r>
         <w:tab/>
-        <w:t>92</w:t>
+        <w:t>93</w:t>
       </w:r>
     </w:p>
     <w:p>
@@ -1019,7 +1063,7 @@
       </w:r>
       <w:r>
         <w:tab/>
-        <w:t>99</w:t>
+        <w:t>100</w:t>
       </w:r>
     </w:p>
     <w:p>
@@ -1035,7 +1079,7 @@
       </w:r>
       <w:r>
         <w:tab/>
-        <w:t>102</w:t>
+        <w:t>103</w:t>
       </w:r>
     </w:p>
     <w:p>
@@ -1058,7 +1102,7 @@
           <w:bCs/>
         </w:rPr>
         <w:tab/>
-        <w:t>104</w:t>
+        <w:t>105</w:t>
       </w:r>
     </w:p>
     <w:p>
@@ -1074,7 +1118,7 @@
       </w:r>
       <w:r>
         <w:tab/>
-        <w:t>104</w:t>
+        <w:t>105</w:t>
       </w:r>
     </w:p>
     <w:p>
@@ -1090,7 +1134,7 @@
       </w:r>
       <w:r>
         <w:tab/>
-        <w:t>106</w:t>
+        <w:t>107</w:t>
       </w:r>
     </w:p>
     <w:p>
@@ -1106,7 +1150,7 @@
       </w:r>
       <w:r>
         <w:tab/>
-        <w:t>108</w:t>
+        <w:t>109</w:t>
       </w:r>
     </w:p>
     <w:p>
@@ -1129,7 +1173,7 @@
           <w:bCs/>
         </w:rPr>
         <w:tab/>
-        <w:t>110</w:t>
+        <w:t>111</w:t>
       </w:r>
     </w:p>
     <w:p>

</xml_diff>

<commit_message>
Manuscript: add Related Systems and comparison table to Chapter II
Four verified sources (El Mrabet & Ait Moussa 2020; Khamaysah et al.
2024; Dellosa 2011; Morallo 2015) added with a comparison table and
references. Existing text and references unchanged; table numbers
shifted by one, with every reference and the list of tables updated.

Co-Authored-By: Claude Opus 5.5 <noreply@anthropic.com>
Claude-Session: https://claude.ai/code/session_013nSRu92KgA9YCzdF5bkKhr
</commit_message>
<xml_diff>
--- a/docs/manuscript/LSIAMS_Manuscript_Final.docx
+++ b/docs/manuscript/LSIAMS_Manuscript_Final.docx
@@ -502,7 +502,7 @@
       </w:r>
       <w:r>
         <w:tab/>
-        <w:t>26</w:t>
+        <w:t>28</w:t>
       </w:r>
     </w:p>
     <w:p>
@@ -525,7 +525,7 @@
           <w:bCs/>
         </w:rPr>
         <w:tab/>
-        <w:t>27</w:t>
+        <w:t>30</w:t>
       </w:r>
     </w:p>
     <w:p>
@@ -541,7 +541,7 @@
       </w:r>
       <w:r>
         <w:tab/>
-        <w:t>27</w:t>
+        <w:t>30</w:t>
       </w:r>
     </w:p>
     <w:p>
@@ -557,7 +557,7 @@
       </w:r>
       <w:r>
         <w:tab/>
-        <w:t>29</w:t>
+        <w:t>32</w:t>
       </w:r>
     </w:p>
     <w:p>
@@ -573,7 +573,7 @@
       </w:r>
       <w:r>
         <w:tab/>
-        <w:t>30</w:t>
+        <w:t>33</w:t>
       </w:r>
     </w:p>
     <w:p>
@@ -589,7 +589,7 @@
       </w:r>
       <w:r>
         <w:tab/>
-        <w:t>33</w:t>
+        <w:t>36</w:t>
       </w:r>
     </w:p>
     <w:p>
@@ -605,7 +605,7 @@
       </w:r>
       <w:r>
         <w:tab/>
-        <w:t>35</w:t>
+        <w:t>38</w:t>
       </w:r>
     </w:p>
     <w:p>
@@ -621,7 +621,7 @@
       </w:r>
       <w:r>
         <w:tab/>
-        <w:t>35</w:t>
+        <w:t>38</w:t>
       </w:r>
     </w:p>
     <w:p>
@@ -637,7 +637,7 @@
       </w:r>
       <w:r>
         <w:tab/>
-        <w:t>38</w:t>
+        <w:t>41</w:t>
       </w:r>
     </w:p>
     <w:p>
@@ -653,7 +653,7 @@
       </w:r>
       <w:r>
         <w:tab/>
-        <w:t>40</w:t>
+        <w:t>43</w:t>
       </w:r>
     </w:p>
     <w:p>
@@ -669,7 +669,7 @@
       </w:r>
       <w:r>
         <w:tab/>
-        <w:t>45</w:t>
+        <w:t>48</w:t>
       </w:r>
     </w:p>
     <w:p>
@@ -685,7 +685,7 @@
       </w:r>
       <w:r>
         <w:tab/>
-        <w:t>46</w:t>
+        <w:t>49</w:t>
       </w:r>
     </w:p>
     <w:p>
@@ -701,7 +701,7 @@
       </w:r>
       <w:r>
         <w:tab/>
-        <w:t>48</w:t>
+        <w:t>51</w:t>
       </w:r>
     </w:p>
     <w:p>
@@ -717,7 +717,7 @@
       </w:r>
       <w:r>
         <w:tab/>
-        <w:t>49</w:t>
+        <w:t>52</w:t>
       </w:r>
     </w:p>
     <w:p>
@@ -733,7 +733,7 @@
       </w:r>
       <w:r>
         <w:tab/>
-        <w:t>51</w:t>
+        <w:t>54</w:t>
       </w:r>
     </w:p>
     <w:p>
@@ -756,7 +756,7 @@
           <w:bCs/>
         </w:rPr>
         <w:tab/>
-        <w:t>53</w:t>
+        <w:t>56</w:t>
       </w:r>
     </w:p>
     <w:p>
@@ -772,7 +772,7 @@
       </w:r>
       <w:r>
         <w:tab/>
-        <w:t>53</w:t>
+        <w:t>56</w:t>
       </w:r>
     </w:p>
     <w:p>
@@ -788,7 +788,7 @@
       </w:r>
       <w:r>
         <w:tab/>
-        <w:t>54</w:t>
+        <w:t>57</w:t>
       </w:r>
     </w:p>
     <w:p>
@@ -804,7 +804,7 @@
       </w:r>
       <w:r>
         <w:tab/>
-        <w:t>57</w:t>
+        <w:t>60</w:t>
       </w:r>
     </w:p>
     <w:p>
@@ -820,7 +820,7 @@
       </w:r>
       <w:r>
         <w:tab/>
-        <w:t>60</w:t>
+        <w:t>63</w:t>
       </w:r>
     </w:p>
     <w:p>
@@ -836,7 +836,7 @@
       </w:r>
       <w:r>
         <w:tab/>
-        <w:t>62</w:t>
+        <w:t>65</w:t>
       </w:r>
     </w:p>
     <w:p>
@@ -852,7 +852,7 @@
       </w:r>
       <w:r>
         <w:tab/>
-        <w:t>63</w:t>
+        <w:t>66</w:t>
       </w:r>
     </w:p>
     <w:p>
@@ -868,7 +868,7 @@
       </w:r>
       <w:r>
         <w:tab/>
-        <w:t>66</w:t>
+        <w:t>69</w:t>
       </w:r>
     </w:p>
     <w:p>
@@ -884,7 +884,7 @@
       </w:r>
       <w:r>
         <w:tab/>
-        <w:t>68</w:t>
+        <w:t>71</w:t>
       </w:r>
     </w:p>
     <w:p>
@@ -901,7 +901,7 @@
       </w:r>
       <w:r>
         <w:tab/>
-        <w:t>76</w:t>
+        <w:t>79</w:t>
       </w:r>
     </w:p>
     <w:p>
@@ -917,7 +917,7 @@
       </w:r>
       <w:r>
         <w:tab/>
-        <w:t>77</w:t>
+        <w:t>80</w:t>
       </w:r>
     </w:p>
     <w:p>
@@ -933,7 +933,7 @@
       </w:r>
       <w:r>
         <w:tab/>
-        <w:t>78</w:t>
+        <w:t>81</w:t>
       </w:r>
     </w:p>
     <w:p>
@@ -949,7 +949,7 @@
       </w:r>
       <w:r>
         <w:tab/>
-        <w:t>78</w:t>
+        <w:t>81</w:t>
       </w:r>
     </w:p>
     <w:p>
@@ -965,7 +965,7 @@
       </w:r>
       <w:r>
         <w:tab/>
-        <w:t>80</w:t>
+        <w:t>83</w:t>
       </w:r>
     </w:p>
     <w:p>
@@ -981,7 +981,7 @@
       </w:r>
       <w:r>
         <w:tab/>
-        <w:t>80</w:t>
+        <w:t>83</w:t>
       </w:r>
     </w:p>
     <w:p>
@@ -997,7 +997,7 @@
       </w:r>
       <w:r>
         <w:tab/>
-        <w:t>81</w:t>
+        <w:t>84</w:t>
       </w:r>
     </w:p>
     <w:p>
@@ -1013,7 +1013,7 @@
       </w:r>
       <w:r>
         <w:tab/>
-        <w:t>92</w:t>
+        <w:t>95</w:t>
       </w:r>
     </w:p>
     <w:p>
@@ -1036,7 +1036,7 @@
           <w:bCs/>
         </w:rPr>
         <w:tab/>
-        <w:t>95</w:t>
+        <w:t>98</w:t>
       </w:r>
     </w:p>
     <w:p>
@@ -1052,7 +1052,7 @@
       </w:r>
       <w:r>
         <w:tab/>
-        <w:t>95</w:t>
+        <w:t>98</w:t>
       </w:r>
     </w:p>
     <w:p>
@@ -1068,7 +1068,7 @@
       </w:r>
       <w:r>
         <w:tab/>
-        <w:t>96</w:t>
+        <w:t>99</w:t>
       </w:r>
     </w:p>
     <w:p>
@@ -1084,7 +1084,7 @@
       </w:r>
       <w:r>
         <w:tab/>
-        <w:t>97</w:t>
+        <w:t>100</w:t>
       </w:r>
     </w:p>
     <w:p>
@@ -1100,7 +1100,7 @@
       </w:r>
       <w:r>
         <w:tab/>
-        <w:t>97</w:t>
+        <w:t>100</w:t>
       </w:r>
     </w:p>
     <w:p>
@@ -1116,7 +1116,7 @@
       </w:r>
       <w:r>
         <w:tab/>
-        <w:t>100</w:t>
+        <w:t>103</w:t>
       </w:r>
     </w:p>
     <w:p>
@@ -1132,7 +1132,7 @@
       </w:r>
       <w:r>
         <w:tab/>
-        <w:t>107</w:t>
+        <w:t>110</w:t>
       </w:r>
     </w:p>
     <w:p>
@@ -1148,7 +1148,7 @@
       </w:r>
       <w:r>
         <w:tab/>
-        <w:t>110</w:t>
+        <w:t>113</w:t>
       </w:r>
     </w:p>
     <w:p>
@@ -1171,7 +1171,7 @@
           <w:bCs/>
         </w:rPr>
         <w:tab/>
-        <w:t>112</w:t>
+        <w:t>115</w:t>
       </w:r>
     </w:p>
     <w:p>
@@ -1187,7 +1187,7 @@
       </w:r>
       <w:r>
         <w:tab/>
-        <w:t>112</w:t>
+        <w:t>115</w:t>
       </w:r>
     </w:p>
     <w:p>
@@ -1203,7 +1203,7 @@
       </w:r>
       <w:r>
         <w:tab/>
-        <w:t>114</w:t>
+        <w:t>117</w:t>
       </w:r>
     </w:p>
     <w:p>
@@ -1219,7 +1219,7 @@
       </w:r>
       <w:r>
         <w:tab/>
-        <w:t>116</w:t>
+        <w:t>119</w:t>
       </w:r>
     </w:p>
     <w:p>
@@ -1242,7 +1242,7 @@
           <w:bCs/>
         </w:rPr>
         <w:tab/>
-        <w:t>118</w:t>
+        <w:t>121</w:t>
       </w:r>
     </w:p>
     <w:p>
@@ -1265,7 +1265,7 @@
           <w:bCs/>
         </w:rPr>
         <w:tab/>
-        <w:t>120</w:t>
+        <w:t>123</w:t>
       </w:r>
     </w:p>
     <w:p>
@@ -1295,11 +1295,11 @@
         <w:ind w:left="720"/>
       </w:pPr>
       <w:r>
-        <w:t>Table 1  Security Plan Test</w:t>
+        <w:t>Table 1  Comparison of Related Systems and L-SIAMS</w:t>
       </w:r>
       <w:r>
         <w:tab/>
-        <w:t>37</w:t>
+        <w:t>27</w:t>
       </w:r>
     </w:p>
     <w:p>
@@ -1311,11 +1311,11 @@
         <w:ind w:left="720"/>
       </w:pPr>
       <w:r>
-        <w:t>Table 2  Respondents and Their Role in the Evaluation</w:t>
+        <w:t>Table 2  Security Plan Test</w:t>
       </w:r>
       <w:r>
         <w:tab/>
-        <w:t>39</w:t>
+        <w:t>40</w:t>
       </w:r>
     </w:p>
     <w:p>
@@ -1327,11 +1327,11 @@
         <w:ind w:left="720"/>
       </w:pPr>
       <w:r>
-        <w:t>Table 3  Likert Scale Interpretation</w:t>
+        <w:t>Table 3  Respondents and Their Role in the Evaluation</w:t>
       </w:r>
       <w:r>
         <w:tab/>
-        <w:t>41</w:t>
+        <w:t>42</w:t>
       </w:r>
     </w:p>
     <w:p>
@@ -1343,11 +1343,11 @@
         <w:ind w:left="720"/>
       </w:pPr>
       <w:r>
-        <w:t>Table 4  Instrument–Metric Mapping</w:t>
+        <w:t>Table 4  Likert Scale Interpretation</w:t>
       </w:r>
       <w:r>
         <w:tab/>
-        <w:t>43</w:t>
+        <w:t>44</w:t>
       </w:r>
     </w:p>
     <w:p>
@@ -1359,11 +1359,11 @@
         <w:ind w:left="720"/>
       </w:pPr>
       <w:r>
-        <w:t>Table 5  SOP–Objectives–Metrics–Instrument Mapping</w:t>
+        <w:t>Table 5  Instrument–Metric Mapping</w:t>
       </w:r>
       <w:r>
         <w:tab/>
-        <w:t>44</w:t>
+        <w:t>46</w:t>
       </w:r>
     </w:p>
     <w:p>
@@ -1375,11 +1375,11 @@
         <w:ind w:left="720"/>
       </w:pPr>
       <w:r>
-        <w:t>Table 6  Interpretation of Mean Scores</w:t>
+        <w:t>Table 6  SOP–Objectives–Metrics–Instrument Mapping</w:t>
       </w:r>
       <w:r>
         <w:tab/>
-        <w:t>49</w:t>
+        <w:t>47</w:t>
       </w:r>
     </w:p>
     <w:p>
@@ -1391,11 +1391,11 @@
         <w:ind w:left="720"/>
       </w:pPr>
       <w:r>
-        <w:t>Table 7  System Evaluation Criteria</w:t>
+        <w:t>Table 7  Interpretation of Mean Scores</w:t>
       </w:r>
       <w:r>
         <w:tab/>
-        <w:t>50</w:t>
+        <w:t>52</w:t>
       </w:r>
     </w:p>
     <w:p>
@@ -1407,11 +1407,11 @@
         <w:ind w:left="720"/>
       </w:pPr>
       <w:r>
-        <w:t>Table 8  Device Request Validation Sequence</w:t>
+        <w:t>Table 8  System Evaluation Criteria</w:t>
       </w:r>
       <w:r>
         <w:tab/>
-        <w:t>69</w:t>
+        <w:t>53</w:t>
       </w:r>
     </w:p>
     <w:p>
@@ -1423,11 +1423,11 @@
         <w:ind w:left="720"/>
       </w:pPr>
       <w:r>
-        <w:t>Table 9  Security Event Types Recorded by the System</w:t>
+        <w:t>Table 9  Device Request Validation Sequence</w:t>
       </w:r>
       <w:r>
         <w:tab/>
-        <w:t>73</w:t>
+        <w:t>72</w:t>
       </w:r>
     </w:p>
     <w:p>
@@ -1439,7 +1439,7 @@
         <w:ind w:left="720"/>
       </w:pPr>
       <w:r>
-        <w:t>Table 10  Threat, Description and Mitigation</w:t>
+        <w:t>Table 10  Security Event Types Recorded by the System</w:t>
       </w:r>
       <w:r>
         <w:tab/>
@@ -1455,11 +1455,11 @@
         <w:ind w:left="720"/>
       </w:pPr>
       <w:r>
-        <w:t>Table 11  CVSS Score Interpretation</w:t>
+        <w:t>Table 11  Threat, Description and Mitigation</w:t>
       </w:r>
       <w:r>
         <w:tab/>
-        <w:t>78</w:t>
+        <w:t>79</w:t>
       </w:r>
     </w:p>
     <w:p>
@@ -1471,11 +1471,11 @@
         <w:ind w:left="720"/>
       </w:pPr>
       <w:r>
-        <w:t>Table 12  Requirements and Implemented Features</w:t>
+        <w:t>Table 12  CVSS Score Interpretation</w:t>
       </w:r>
       <w:r>
         <w:tab/>
-        <w:t>95</w:t>
+        <w:t>81</w:t>
       </w:r>
     </w:p>
     <w:p>
@@ -1487,11 +1487,11 @@
         <w:ind w:left="720"/>
       </w:pPr>
       <w:r>
-        <w:t>Table 13  Module Development Status</w:t>
+        <w:t>Table 13  Requirements and Implemented Features</w:t>
       </w:r>
       <w:r>
         <w:tab/>
-        <w:t>97</w:t>
+        <w:t>98</w:t>
       </w:r>
     </w:p>
     <w:p>
@@ -1503,11 +1503,11 @@
         <w:ind w:left="720"/>
       </w:pPr>
       <w:r>
-        <w:t>Table 14  Penetration Testing Results</w:t>
+        <w:t>Table 14  Module Development Status</w:t>
       </w:r>
       <w:r>
         <w:tab/>
-        <w:t>98</w:t>
+        <w:t>100</w:t>
       </w:r>
     </w:p>
     <w:p>
@@ -1519,11 +1519,11 @@
         <w:ind w:left="720"/>
       </w:pPr>
       <w:r>
-        <w:t>Table 15  Security Events Recorded During Deployment (October 13–14, 2026)</w:t>
+        <w:t>Table 15  Penetration Testing Results</w:t>
       </w:r>
       <w:r>
         <w:tab/>
-        <w:t>98</w:t>
+        <w:t>101</w:t>
       </w:r>
     </w:p>
     <w:p>
@@ -1535,11 +1535,11 @@
         <w:ind w:left="720"/>
       </w:pPr>
       <w:r>
-        <w:t>Table 16  Teacher Identity Verification</w:t>
+        <w:t>Table 16  Security Events Recorded During Deployment (October 13–14, 2026)</w:t>
       </w:r>
       <w:r>
         <w:tab/>
-        <w:t>100</w:t>
+        <w:t>101</w:t>
       </w:r>
     </w:p>
     <w:p>
@@ -1551,11 +1551,11 @@
         <w:ind w:left="720"/>
       </w:pPr>
       <w:r>
-        <w:t>Table 17  Recording Time in the Queue Sessions</w:t>
+        <w:t>Table 17  Teacher Identity Verification</w:t>
       </w:r>
       <w:r>
         <w:tab/>
-        <w:t>101</w:t>
+        <w:t>103</w:t>
       </w:r>
     </w:p>
     <w:p>
@@ -1567,11 +1567,11 @@
         <w:ind w:left="720"/>
       </w:pPr>
       <w:r>
-        <w:t>Table 18  Comparison of the Manual Roll Call and L-SIAMS</w:t>
+        <w:t>Table 18  Recording Time in the Queue Sessions</w:t>
       </w:r>
       <w:r>
         <w:tab/>
-        <w:t>102</w:t>
+        <w:t>104</w:t>
       </w:r>
     </w:p>
     <w:p>
@@ -1583,11 +1583,11 @@
         <w:ind w:left="720"/>
       </w:pPr>
       <w:r>
-        <w:t>Table 19  Attendance Records and Accuracy (19 Class Sessions)</w:t>
+        <w:t>Table 19  Comparison of the Manual Roll Call and L-SIAMS</w:t>
       </w:r>
       <w:r>
         <w:tab/>
-        <w:t>103</w:t>
+        <w:t>105</w:t>
       </w:r>
     </w:p>
     <w:p>
@@ -1599,11 +1599,11 @@
         <w:ind w:left="720"/>
       </w:pPr>
       <w:r>
-        <w:t>Table 20  Profile of Respondents</w:t>
+        <w:t>Table 20  Attendance Records and Accuracy (19 Class Sessions)</w:t>
       </w:r>
       <w:r>
         <w:tab/>
-        <w:t>104</w:t>
+        <w:t>106</w:t>
       </w:r>
     </w:p>
     <w:p>
@@ -1615,11 +1615,11 @@
         <w:ind w:left="720"/>
       </w:pPr>
       <w:r>
-        <w:t>Table 21  Security Evaluation by CIA Dimension</w:t>
+        <w:t>Table 21  Profile of Respondents</w:t>
       </w:r>
       <w:r>
         <w:tab/>
-        <w:t>105</w:t>
+        <w:t>107</w:t>
       </w:r>
     </w:p>
     <w:p>
@@ -1631,11 +1631,11 @@
         <w:ind w:left="720"/>
       </w:pPr>
       <w:r>
-        <w:t>Table 22  Part D Technical Control Checklist</w:t>
+        <w:t>Table 22  Security Evaluation by CIA Dimension</w:t>
       </w:r>
       <w:r>
         <w:tab/>
-        <w:t>106</w:t>
+        <w:t>108</w:t>
       </w:r>
     </w:p>
     <w:p>
@@ -1647,11 +1647,11 @@
         <w:ind w:left="720"/>
       </w:pPr>
       <w:r>
-        <w:t>Table 23  User Acceptance Test Results</w:t>
+        <w:t>Table 23  Part D Technical Control Checklist</w:t>
       </w:r>
       <w:r>
         <w:tab/>
-        <w:t>108</w:t>
+        <w:t>109</w:t>
       </w:r>
     </w:p>
     <w:p>
@@ -1663,11 +1663,11 @@
         <w:ind w:left="720"/>
       </w:pPr>
       <w:r>
-        <w:t>Table G1  Development Test Suites</w:t>
+        <w:t>Table 24  User Acceptance Test Results</w:t>
       </w:r>
       <w:r>
         <w:tab/>
-        <w:t>128</w:t>
+        <w:t>111</w:t>
       </w:r>
     </w:p>
     <w:p>
@@ -1679,11 +1679,11 @@
         <w:ind w:left="720"/>
       </w:pPr>
       <w:r>
-        <w:t>Table G2  Recording Time of All Deployment Sessions</w:t>
+        <w:t>Table G1  Development Test Suites</w:t>
       </w:r>
       <w:r>
         <w:tab/>
-        <w:t>128</w:t>
+        <w:t>131</w:t>
       </w:r>
     </w:p>
     <w:p>
@@ -1695,29 +1695,11 @@
         <w:ind w:left="720"/>
       </w:pPr>
       <w:r>
-        <w:t>Table G3  Outcome of RFID Taps (All Sessions, October 13–14, 2026)</w:t>
+        <w:t>Table G2  Recording Time of All Deployment Sessions</w:t>
       </w:r>
       <w:r>
         <w:tab/>
-        <w:t>130</w:t>
-      </w:r>
-    </w:p>
-    <w:p>
-      <w:r>
-        <w:br w:type="page"/>
-      </w:r>
-    </w:p>
-    <w:p>
-      <w:pPr>
-        <w:spacing w:after="240"/>
-        <w:jc w:val="center"/>
-      </w:pPr>
-      <w:r>
-        <w:rPr>
-          <w:b/>
-          <w:bCs/>
-        </w:rPr>
-        <w:t xml:space="preserve">LIST OF FIGURES</w:t>
+        <w:t>131</w:t>
       </w:r>
     </w:p>
     <w:p>
@@ -1729,11 +1711,29 @@
         <w:ind w:left="720"/>
       </w:pPr>
       <w:r>
-        <w:t>Figure 1  Methodological Flow of the Study</w:t>
+        <w:t>Table G3  Outcome of RFID Taps (All Sessions, October 13–14, 2026)</w:t>
       </w:r>
       <w:r>
         <w:tab/>
-        <w:t>29</w:t>
+        <w:t>133</w:t>
+      </w:r>
+    </w:p>
+    <w:p>
+      <w:r>
+        <w:br w:type="page"/>
+      </w:r>
+    </w:p>
+    <w:p>
+      <w:pPr>
+        <w:spacing w:after="240"/>
+        <w:jc w:val="center"/>
+      </w:pPr>
+      <w:r>
+        <w:rPr>
+          <w:b/>
+          <w:bCs/>
+        </w:rPr>
+        <w:t xml:space="preserve">LIST OF FIGURES</w:t>
       </w:r>
     </w:p>
     <w:p>
@@ -1745,11 +1745,11 @@
         <w:ind w:left="720"/>
       </w:pPr>
       <w:r>
-        <w:t>Figure 2  Iterative System Development Life Cycle Diagram</w:t>
+        <w:t>Figure 1  Methodological Flow of the Study</w:t>
       </w:r>
       <w:r>
         <w:tab/>
-        <w:t>30</w:t>
+        <w:t>32</w:t>
       </w:r>
     </w:p>
     <w:p>
@@ -1761,11 +1761,11 @@
         <w:ind w:left="720"/>
       </w:pPr>
       <w:r>
-        <w:t>Figure 3  System Design Diagram</w:t>
+        <w:t>Figure 2  Iterative System Development Life Cycle Diagram</w:t>
       </w:r>
       <w:r>
         <w:tab/>
-        <w:t>34</w:t>
+        <w:t>33</w:t>
       </w:r>
     </w:p>
     <w:p>
@@ -1777,11 +1777,11 @@
         <w:ind w:left="720"/>
       </w:pPr>
       <w:r>
-        <w:t>Figure 4  Experimental Setup and Process Flow Diagram</w:t>
+        <w:t>Figure 3  System Design Diagram</w:t>
       </w:r>
       <w:r>
         <w:tab/>
-        <w:t>47</w:t>
+        <w:t>37</w:t>
       </w:r>
     </w:p>
     <w:p>
@@ -1793,11 +1793,11 @@
         <w:ind w:left="720"/>
       </w:pPr>
       <w:r>
-        <w:t>Figure 5  Data Flow Across System Layers</w:t>
+        <w:t>Figure 4  Experimental Setup and Process Flow Diagram</w:t>
       </w:r>
       <w:r>
         <w:tab/>
-        <w:t>54</w:t>
+        <w:t>50</w:t>
       </w:r>
     </w:p>
     <w:p>
@@ -1809,11 +1809,11 @@
         <w:ind w:left="720"/>
       </w:pPr>
       <w:r>
-        <w:t>Figure 6  System Architecture Diagram</w:t>
+        <w:t>Figure 5  Data Flow Across System Layers</w:t>
       </w:r>
       <w:r>
         <w:tab/>
-        <w:t>55</w:t>
+        <w:t>57</w:t>
       </w:r>
     </w:p>
     <w:p>
@@ -1825,7 +1825,7 @@
         <w:ind w:left="720"/>
       </w:pPr>
       <w:r>
-        <w:t>Figure 7  IoT Device Diagram</w:t>
+        <w:t>Figure 6  System Architecture Diagram</w:t>
       </w:r>
       <w:r>
         <w:tab/>
@@ -1841,7 +1841,7 @@
         <w:ind w:left="720"/>
       </w:pPr>
       <w:r>
-        <w:t>Figure 8  Network Architecture</w:t>
+        <w:t>Figure 7  IoT Device Diagram</w:t>
       </w:r>
       <w:r>
         <w:tab/>
@@ -1857,7 +1857,7 @@
         <w:ind w:left="720"/>
       </w:pPr>
       <w:r>
-        <w:t>Figure 9  Entity Relationship Diagram</w:t>
+        <w:t>Figure 8  Network Architecture</w:t>
       </w:r>
       <w:r>
         <w:tab/>
@@ -1873,11 +1873,11 @@
         <w:ind w:left="720"/>
       </w:pPr>
       <w:r>
-        <w:t>Figure 10  Data Flow Diagram</w:t>
+        <w:t>Figure 9  Entity Relationship Diagram</w:t>
       </w:r>
       <w:r>
         <w:tab/>
-        <w:t>66</w:t>
+        <w:t>67</w:t>
       </w:r>
     </w:p>
     <w:p>
@@ -1889,11 +1889,11 @@
         <w:ind w:left="720"/>
       </w:pPr>
       <w:r>
-        <w:t>Figure 11  Security Architecture Diagram</w:t>
+        <w:t>Figure 10  Data Flow Diagram</w:t>
       </w:r>
       <w:r>
         <w:tab/>
-        <w:t>74</w:t>
+        <w:t>69</w:t>
       </w:r>
     </w:p>
     <w:p>
@@ -1905,11 +1905,11 @@
         <w:ind w:left="720"/>
       </w:pPr>
       <w:r>
-        <w:t>Figure 12  Terminal Wiring and Connectivity</w:t>
+        <w:t>Figure 11  Security Architecture Diagram</w:t>
       </w:r>
       <w:r>
         <w:tab/>
-        <w:t>81</w:t>
+        <w:t>77</w:t>
       </w:r>
     </w:p>
     <w:p>
@@ -1921,11 +1921,11 @@
         <w:ind w:left="720"/>
       </w:pPr>
       <w:r>
-        <w:t>Figure 13  System Sign-In Screen</w:t>
+        <w:t>Figure 12  Terminal Wiring and Connectivity</w:t>
       </w:r>
       <w:r>
         <w:tab/>
-        <w:t>82</w:t>
+        <w:t>84</w:t>
       </w:r>
     </w:p>
     <w:p>
@@ -1937,11 +1937,11 @@
         <w:ind w:left="720"/>
       </w:pPr>
       <w:r>
-        <w:t>Figure 14  User Account and Role Management</w:t>
+        <w:t>Figure 13  System Sign-In Screen</w:t>
       </w:r>
       <w:r>
         <w:tab/>
-        <w:t>82</w:t>
+        <w:t>85</w:t>
       </w:r>
     </w:p>
     <w:p>
@@ -1953,11 +1953,11 @@
         <w:ind w:left="720"/>
       </w:pPr>
       <w:r>
-        <w:t>Figure 15  Registered IoT Terminal Registry</w:t>
+        <w:t>Figure 14  User Account and Role Management</w:t>
       </w:r>
       <w:r>
         <w:tab/>
-        <w:t>83</w:t>
+        <w:t>85</w:t>
       </w:r>
     </w:p>
     <w:p>
@@ -1969,11 +1969,11 @@
         <w:ind w:left="720"/>
       </w:pPr>
       <w:r>
-        <w:t>Figure 16  Terminal Detail and Credential Management</w:t>
+        <w:t>Figure 15  Registered IoT Terminal Registry</w:t>
       </w:r>
       <w:r>
         <w:tab/>
-        <w:t>85</w:t>
+        <w:t>86</w:t>
       </w:r>
     </w:p>
     <w:p>
@@ -1985,11 +1985,11 @@
         <w:ind w:left="720"/>
       </w:pPr>
       <w:r>
-        <w:t>Figure 17  Security Event Log</w:t>
+        <w:t>Figure 16  Terminal Detail and Credential Management</w:t>
       </w:r>
       <w:r>
         <w:tab/>
-        <w:t>86</w:t>
+        <w:t>88</w:t>
       </w:r>
     </w:p>
     <w:p>
@@ -2001,11 +2001,11 @@
         <w:ind w:left="720"/>
       </w:pPr>
       <w:r>
-        <w:t>Figure 18  Audit Trail</w:t>
+        <w:t>Figure 17  Security Event Log</w:t>
       </w:r>
       <w:r>
         <w:tab/>
-        <w:t>87</w:t>
+        <w:t>89</w:t>
       </w:r>
     </w:p>
     <w:p>
@@ -2017,11 +2017,11 @@
         <w:ind w:left="720"/>
       </w:pPr>
       <w:r>
-        <w:t>Figure 19  Fingerprint Enrolment</w:t>
+        <w:t>Figure 18  Audit Trail</w:t>
       </w:r>
       <w:r>
         <w:tab/>
-        <w:t>88</w:t>
+        <w:t>90</w:t>
       </w:r>
     </w:p>
     <w:p>
@@ -2033,11 +2033,11 @@
         <w:ind w:left="720"/>
       </w:pPr>
       <w:r>
-        <w:t>Figure 20  Administrator Dashboard</w:t>
+        <w:t>Figure 19  Fingerprint Enrolment</w:t>
       </w:r>
       <w:r>
         <w:tab/>
-        <w:t>89</w:t>
+        <w:t>91</w:t>
       </w:r>
     </w:p>
     <w:p>
@@ -2049,11 +2049,11 @@
         <w:ind w:left="720"/>
       </w:pPr>
       <w:r>
-        <w:t>Figure 21  Teacher Portal Dashboard</w:t>
+        <w:t>Figure 20  Administrator Dashboard</w:t>
       </w:r>
       <w:r>
         <w:tab/>
-        <w:t>90</w:t>
+        <w:t>92</w:t>
       </w:r>
     </w:p>
     <w:p>
@@ -2065,11 +2065,11 @@
         <w:ind w:left="720"/>
       </w:pPr>
       <w:r>
-        <w:t>Figure 22  Student Register</w:t>
+        <w:t>Figure 21  Teacher Portal Dashboard</w:t>
       </w:r>
       <w:r>
         <w:tab/>
-        <w:t>91</w:t>
+        <w:t>93</w:t>
       </w:r>
     </w:p>
     <w:p>
@@ -2081,11 +2081,11 @@
         <w:ind w:left="720"/>
       </w:pPr>
       <w:r>
-        <w:t>Figure 23  Backup and Restore</w:t>
+        <w:t>Figure 22  Student Register</w:t>
       </w:r>
       <w:r>
         <w:tab/>
-        <w:t>92</w:t>
+        <w:t>94</w:t>
       </w:r>
     </w:p>
     <w:p>
@@ -2097,11 +2097,11 @@
         <w:ind w:left="720"/>
       </w:pPr>
       <w:r>
-        <w:t>Figure 24  Wireshark Capture of Terminal and Server Traffic</w:t>
+        <w:t>Figure 23  Backup and Restore</w:t>
       </w:r>
       <w:r>
         <w:tab/>
-        <w:t>92</w:t>
+        <w:t>95</w:t>
       </w:r>
     </w:p>
     <w:p>
@@ -2113,11 +2113,11 @@
         <w:ind w:left="720"/>
       </w:pPr>
       <w:r>
-        <w:t>Figure 25  Hydra Brute-Force Test Against the Sign-In Page</w:t>
+        <w:t>Figure 24  Wireshark Capture of Terminal and Server Traffic</w:t>
       </w:r>
       <w:r>
         <w:tab/>
-        <w:t>93</w:t>
+        <w:t>95</w:t>
       </w:r>
     </w:p>
     <w:p>
@@ -2129,11 +2129,11 @@
         <w:ind w:left="720"/>
       </w:pPr>
       <w:r>
-        <w:t>Figure 26  Account Lockout Event in the Security Center</w:t>
+        <w:t>Figure 25  Hydra Brute-Force Test Against the Sign-In Page</w:t>
       </w:r>
       <w:r>
         <w:tab/>
-        <w:t>93</w:t>
+        <w:t>96</w:t>
       </w:r>
     </w:p>
     <w:p>
@@ -2145,11 +2145,11 @@
         <w:ind w:left="720"/>
       </w:pPr>
       <w:r>
-        <w:t>Figure 27  Nmap Scan of the L-SIAMS Server</w:t>
+        <w:t>Figure 26  Account Lockout Event in the Security Center</w:t>
       </w:r>
       <w:r>
         <w:tab/>
-        <w:t>93</w:t>
+        <w:t>96</w:t>
       </w:r>
     </w:p>
     <w:p>
@@ -2161,11 +2161,11 @@
         <w:ind w:left="720"/>
       </w:pPr>
       <w:r>
-        <w:t>Figure 28  Rejected Forged Device Requests</w:t>
+        <w:t>Figure 27  Nmap Scan of the L-SIAMS Server</w:t>
       </w:r>
       <w:r>
         <w:tab/>
-        <w:t>94</w:t>
+        <w:t>96</w:t>
       </w:r>
     </w:p>
     <w:p>
@@ -2177,11 +2177,11 @@
         <w:ind w:left="720"/>
       </w:pPr>
       <w:r>
-        <w:t>Figure 29  Device Authentication Events in the Security Center</w:t>
+        <w:t>Figure 28  Rejected Forged Device Requests</w:t>
       </w:r>
       <w:r>
         <w:tab/>
-        <w:t>94</w:t>
+        <w:t>97</w:t>
       </w:r>
     </w:p>
     <w:p>
@@ -2193,11 +2193,11 @@
         <w:ind w:left="720"/>
       </w:pPr>
       <w:r>
-        <w:t>Figure 30  Security Events Recorded During Deployment</w:t>
+        <w:t>Figure 29  Device Authentication Events in the Security Center</w:t>
       </w:r>
       <w:r>
         <w:tab/>
-        <w:t>99</w:t>
+        <w:t>97</w:t>
       </w:r>
     </w:p>
     <w:p>
@@ -2209,11 +2209,11 @@
         <w:ind w:left="720"/>
       </w:pPr>
       <w:r>
-        <w:t>Figure 31  Time per Student in the Queue Sessions</w:t>
+        <w:t>Figure 30  Security Events Recorded During Deployment</w:t>
       </w:r>
       <w:r>
         <w:tab/>
-        <w:t>101</w:t>
+        <w:t>102</w:t>
       </w:r>
     </w:p>
     <w:p>
@@ -2225,11 +2225,11 @@
         <w:ind w:left="720"/>
       </w:pPr>
       <w:r>
-        <w:t>Figure 32  Time per Student of the Manual Roll Call and L-SIAMS</w:t>
+        <w:t>Figure 31  Time per Student in the Queue Sessions</w:t>
       </w:r>
       <w:r>
         <w:tab/>
-        <w:t>102</w:t>
+        <w:t>104</w:t>
       </w:r>
     </w:p>
     <w:p>
@@ -2241,11 +2241,11 @@
         <w:ind w:left="720"/>
       </w:pPr>
       <w:r>
-        <w:t>Figure 33  Attendance Records by Type</w:t>
+        <w:t>Figure 32  Time per Student of the Manual Roll Call and L-SIAMS</w:t>
       </w:r>
       <w:r>
         <w:tab/>
-        <w:t>104</w:t>
+        <w:t>105</w:t>
       </w:r>
     </w:p>
     <w:p>
@@ -2257,11 +2257,11 @@
         <w:ind w:left="720"/>
       </w:pPr>
       <w:r>
-        <w:t>Figure 34  Security Evaluation by CIA Dimension</w:t>
+        <w:t>Figure 33  Attendance Records by Type</w:t>
       </w:r>
       <w:r>
         <w:tab/>
-        <w:t>106</w:t>
+        <w:t>107</w:t>
       </w:r>
     </w:p>
     <w:p>
@@ -2273,7 +2273,7 @@
         <w:ind w:left="720"/>
       </w:pPr>
       <w:r>
-        <w:t>Figure 35  User Acceptance Test Results</w:t>
+        <w:t>Figure 34  Security Evaluation by CIA Dimension</w:t>
       </w:r>
       <w:r>
         <w:tab/>
@@ -2289,11 +2289,11 @@
         <w:ind w:left="720"/>
       </w:pPr>
       <w:r>
-        <w:t>Figure 36  Orientation of Teachers and IT Administrators (October 12, 2026)</w:t>
+        <w:t>Figure 35  User Acceptance Test Results</w:t>
       </w:r>
       <w:r>
         <w:tab/>
-        <w:t>110</w:t>
+        <w:t>112</w:t>
       </w:r>
     </w:p>
     <w:p>
@@ -2305,11 +2305,27 @@
         <w:ind w:left="720"/>
       </w:pPr>
       <w:r>
+        <w:t>Figure 36  Orientation of Teachers and IT Administrators (October 12, 2026)</w:t>
+      </w:r>
+      <w:r>
+        <w:tab/>
+        <w:t>113</w:t>
+      </w:r>
+    </w:p>
+    <w:p>
+      <w:pPr>
+        <w:tabs>
+          <w:tab w:val="right" w:leader="dot" w:pos="8640"/>
+        </w:tabs>
+        <w:spacing w:after="80"/>
+        <w:ind w:left="720"/>
+      </w:pPr>
+      <w:r>
         <w:t>Figure 37  Classroom Terminal Deployed at Top Achievers Private School Inc.</w:t>
       </w:r>
       <w:r>
         <w:tab/>
-        <w:t>110</w:t>
+        <w:t>113</w:t>
       </w:r>
     </w:p>
     <w:p>
@@ -4255,6 +4271,1002 @@
       <w:r>
         <w:lastRenderedPageBreak/>
         <w:t>functionality while providing limited implementation of encryption, access control, audit logging, and network-level security protections.</w:t>
+      </w:r>
+    </w:p>
+    <w:p>
+      <w:pPr>
+        <w:spacing w:before="120" w:line="480" w:lineRule="auto"/>
+        <w:ind w:firstLine="284"/>
+      </w:pPr>
+      <w:r>
+        <w:rPr>
+          <w:b/>
+          <w:bCs/>
+        </w:rPr>
+        <w:t xml:space="preserve">Related Systems</w:t>
+      </w:r>
+    </w:p>
+    <w:p>
+      <w:pPr>
+        <w:spacing w:line="480" w:lineRule="auto"/>
+        <w:ind w:left="284" w:firstLine="720"/>
+        <w:jc w:val="both"/>
+      </w:pPr>
+      <w:r>
+        <w:t xml:space="preserve">This section reviews existing attendance systems that are similar to L-SIAMS in purpose or technology. Table 1 compares them with L-SIAMS in terms of target users, major features, technology, limitations, and relevance to the present project.</w:t>
+      </w:r>
+    </w:p>
+    <w:p>
+      <w:pPr>
+        <w:spacing w:line="480" w:lineRule="auto"/>
+        <w:ind w:left="284" w:firstLine="720"/>
+        <w:jc w:val="both"/>
+      </w:pPr>
+      <w:r>
+        <w:t xml:space="preserve">El Mrabet and Ait Moussa (2020) developed an IoT-based school attendance system that recorded student attendance through RFID, transmitted the attendance records to the school administration, and notified parents of absences by email or SMS, with the aim of reducing student dropout.</w:t>
+      </w:r>
+    </w:p>
+    <w:p>
+      <w:pPr>
+        <w:spacing w:line="480" w:lineRule="auto"/>
+        <w:ind w:left="284" w:firstLine="720"/>
+        <w:jc w:val="both"/>
+      </w:pPr>
+      <w:r>
+        <w:t xml:space="preserve">Khamaysah, Hijjeh, and Odeh (2024) designed an IoT-based attendance system that combined RFID tags with fingerprint authentication at the entrance of a classroom or workplace and sent the records through Wi-Fi to a central web-based database. The authors reported improved accuracy, efficiency, and security, although no numerical evaluation was presented in their abstract.</w:t>
+      </w:r>
+    </w:p>
+    <w:p>
+      <w:pPr>
+        <w:spacing w:line="480" w:lineRule="auto"/>
+        <w:ind w:left="284" w:firstLine="720"/>
+        <w:jc w:val="both"/>
+      </w:pPr>
+      <w:r>
+        <w:t xml:space="preserve">Locally, Dellosa (2011) developed a student monitoring system at the Lyceum of the Philippines University–Laguna that used low-frequency RFID and Short Messaging Service (SMS) to record the entry and exit times of students on campus, and that could send entry and exit times, account balances, and class schedules by SMS. The accuracy of the system was tested using a chi-square test.</w:t>
+      </w:r>
+    </w:p>
+    <w:p>
+      <w:pPr>
+        <w:spacing w:line="480" w:lineRule="auto"/>
+        <w:ind w:left="284" w:firstLine="720"/>
+        <w:jc w:val="both"/>
+      </w:pPr>
+      <w:r>
+        <w:t xml:space="preserve">Morallo (2015) developed the LPU-Laguna Student Electronic Attendance and Logging System (SEALS), which logged student entry and exit at the main gate using RFID cards, sent SMS messages to parents, and provided a web portal for logs and attendance. The system was built with VB .NET, PHP, and MySQL.</w:t>
+      </w:r>
+    </w:p>
+    <w:p>
+      <w:pPr>
+        <w:keepNext/>
+        <w:spacing w:before="240" w:line="480" w:lineRule="auto"/>
+      </w:pPr>
+      <w:r>
+        <w:rPr>
+          <w:b/>
+          <w:bCs/>
+        </w:rPr>
+        <w:t xml:space="preserve">Table 1</w:t>
+      </w:r>
+    </w:p>
+    <w:p>
+      <w:pPr>
+        <w:keepNext/>
+        <w:spacing w:line="480" w:lineRule="auto"/>
+      </w:pPr>
+      <w:r>
+        <w:rPr>
+          <w:i/>
+          <w:iCs/>
+        </w:rPr>
+        <w:t xml:space="preserve">Comparison of Related Systems and L-SIAMS</w:t>
+      </w:r>
+    </w:p>
+    <w:tbl>
+      <w:tblPr>
+        <w:tblW w:w="8640" w:type="dxa"/>
+        <w:tblBorders>
+          <w:top w:val="single" w:sz="4" w:space="0" w:color="auto"/>
+          <w:left w:val="single" w:sz="4" w:space="0" w:color="auto"/>
+          <w:bottom w:val="single" w:sz="4" w:space="0" w:color="auto"/>
+          <w:right w:val="single" w:sz="4" w:space="0" w:color="auto"/>
+          <w:insideH w:val="single" w:sz="4" w:space="0" w:color="auto"/>
+          <w:insideV w:val="single" w:sz="4" w:space="0" w:color="auto"/>
+        </w:tblBorders>
+        <w:tblCellMar>
+          <w:left w:w="10" w:type="dxa"/>
+          <w:right w:w="10" w:type="dxa"/>
+        </w:tblCellMar>
+        <w:tblLook w:val="04A0" w:firstRow="1" w:lastRow="0" w:firstColumn="1" w:lastColumn="0" w:noHBand="0" w:noVBand="1"/>
+      </w:tblPr>
+      <w:tblGrid>
+        <w:gridCol w:w="1450"/>
+        <w:gridCol w:w="1300"/>
+        <w:gridCol w:w="1750"/>
+        <w:gridCol w:w="1400"/>
+        <w:gridCol w:w="1550"/>
+        <w:gridCol w:w="1190"/>
+      </w:tblGrid>
+      <w:tr>
+        <w:trPr>
+          <w:tblHeader/>
+        </w:trPr>
+        <w:tc>
+          <w:tcPr>
+            <w:tcW w:w="1450" w:type="dxa"/>
+            <w:shd w:val="clear" w:color="auto" w:fill="E8E8E8"/>
+            <w:tcMar>
+              <w:top w:w="60" w:type="dxa"/>
+              <w:left w:w="90" w:type="dxa"/>
+              <w:bottom w:w="60" w:type="dxa"/>
+              <w:right w:w="90" w:type="dxa"/>
+            </w:tcMar>
+          </w:tcPr>
+          <w:p>
+            <w:pPr>
+              <w:spacing w:before="40" w:after="40"/>
+            </w:pPr>
+            <w:r>
+              <w:rPr>
+                <w:b/>
+                <w:bCs/>
+                <w:szCs w:val="20"/>
+                <w:sz w:val="18"/>
+              </w:rPr>
+              <w:t xml:space="preserve">System</w:t>
+            </w:r>
+          </w:p>
+        </w:tc>
+        <w:tc>
+          <w:tcPr>
+            <w:tcW w:w="1300" w:type="dxa"/>
+            <w:shd w:val="clear" w:color="auto" w:fill="E8E8E8"/>
+            <w:tcMar>
+              <w:top w:w="60" w:type="dxa"/>
+              <w:left w:w="90" w:type="dxa"/>
+              <w:bottom w:w="60" w:type="dxa"/>
+              <w:right w:w="90" w:type="dxa"/>
+            </w:tcMar>
+          </w:tcPr>
+          <w:p>
+            <w:pPr>
+              <w:spacing w:before="40" w:after="40"/>
+            </w:pPr>
+            <w:r>
+              <w:rPr>
+                <w:b/>
+                <w:bCs/>
+                <w:szCs w:val="20"/>
+                <w:sz w:val="18"/>
+              </w:rPr>
+              <w:t xml:space="preserve">Target Users</w:t>
+            </w:r>
+          </w:p>
+        </w:tc>
+        <w:tc>
+          <w:tcPr>
+            <w:tcW w:w="1750" w:type="dxa"/>
+            <w:shd w:val="clear" w:color="auto" w:fill="E8E8E8"/>
+            <w:tcMar>
+              <w:top w:w="60" w:type="dxa"/>
+              <w:left w:w="90" w:type="dxa"/>
+              <w:bottom w:w="60" w:type="dxa"/>
+              <w:right w:w="90" w:type="dxa"/>
+            </w:tcMar>
+          </w:tcPr>
+          <w:p>
+            <w:pPr>
+              <w:spacing w:before="40" w:after="40"/>
+            </w:pPr>
+            <w:r>
+              <w:rPr>
+                <w:b/>
+                <w:bCs/>
+                <w:szCs w:val="20"/>
+                <w:sz w:val="18"/>
+              </w:rPr>
+              <w:t xml:space="preserve">Major Features</w:t>
+            </w:r>
+          </w:p>
+        </w:tc>
+        <w:tc>
+          <w:tcPr>
+            <w:tcW w:w="1400" w:type="dxa"/>
+            <w:shd w:val="clear" w:color="auto" w:fill="E8E8E8"/>
+            <w:tcMar>
+              <w:top w:w="60" w:type="dxa"/>
+              <w:left w:w="90" w:type="dxa"/>
+              <w:bottom w:w="60" w:type="dxa"/>
+              <w:right w:w="90" w:type="dxa"/>
+            </w:tcMar>
+          </w:tcPr>
+          <w:p>
+            <w:pPr>
+              <w:spacing w:before="40" w:after="40"/>
+            </w:pPr>
+            <w:r>
+              <w:rPr>
+                <w:b/>
+                <w:bCs/>
+                <w:szCs w:val="20"/>
+                <w:sz w:val="18"/>
+              </w:rPr>
+              <w:t xml:space="preserve">Technology</w:t>
+            </w:r>
+          </w:p>
+        </w:tc>
+        <w:tc>
+          <w:tcPr>
+            <w:tcW w:w="1550" w:type="dxa"/>
+            <w:shd w:val="clear" w:color="auto" w:fill="E8E8E8"/>
+            <w:tcMar>
+              <w:top w:w="60" w:type="dxa"/>
+              <w:left w:w="90" w:type="dxa"/>
+              <w:bottom w:w="60" w:type="dxa"/>
+              <w:right w:w="90" w:type="dxa"/>
+            </w:tcMar>
+          </w:tcPr>
+          <w:p>
+            <w:pPr>
+              <w:spacing w:before="40" w:after="40"/>
+            </w:pPr>
+            <w:r>
+              <w:rPr>
+                <w:b/>
+                <w:bCs/>
+                <w:szCs w:val="20"/>
+                <w:sz w:val="18"/>
+              </w:rPr>
+              <w:t xml:space="preserve">Limitation</w:t>
+            </w:r>
+          </w:p>
+        </w:tc>
+        <w:tc>
+          <w:tcPr>
+            <w:tcW w:w="1190" w:type="dxa"/>
+            <w:shd w:val="clear" w:color="auto" w:fill="E8E8E8"/>
+            <w:tcMar>
+              <w:top w:w="60" w:type="dxa"/>
+              <w:left w:w="90" w:type="dxa"/>
+              <w:bottom w:w="60" w:type="dxa"/>
+              <w:right w:w="90" w:type="dxa"/>
+            </w:tcMar>
+          </w:tcPr>
+          <w:p>
+            <w:pPr>
+              <w:spacing w:before="40" w:after="40"/>
+            </w:pPr>
+            <w:r>
+              <w:rPr>
+                <w:b/>
+                <w:bCs/>
+                <w:szCs w:val="20"/>
+                <w:sz w:val="18"/>
+              </w:rPr>
+              <w:t xml:space="preserve">Relevance</w:t>
+            </w:r>
+          </w:p>
+        </w:tc>
+      </w:tr>
+      <w:tr>
+        <w:tc>
+          <w:tcPr>
+            <w:tcW w:w="1450" w:type="dxa"/>
+            <w:tcMar>
+              <w:top w:w="60" w:type="dxa"/>
+              <w:left w:w="90" w:type="dxa"/>
+              <w:bottom w:w="60" w:type="dxa"/>
+              <w:right w:w="90" w:type="dxa"/>
+            </w:tcMar>
+          </w:tcPr>
+          <w:p>
+            <w:pPr>
+              <w:spacing w:before="40" w:after="40"/>
+            </w:pPr>
+            <w:r>
+              <w:rPr>
+                <w:szCs w:val="20"/>
+                <w:sz w:val="18"/>
+              </w:rPr>
+              <w:t xml:space="preserve">El Mrabet &amp; Ait Moussa (2020), Morocco</w:t>
+            </w:r>
+          </w:p>
+        </w:tc>
+        <w:tc>
+          <w:tcPr>
+            <w:tcW w:w="1300" w:type="dxa"/>
+            <w:tcMar>
+              <w:top w:w="60" w:type="dxa"/>
+              <w:left w:w="90" w:type="dxa"/>
+              <w:bottom w:w="60" w:type="dxa"/>
+              <w:right w:w="90" w:type="dxa"/>
+            </w:tcMar>
+          </w:tcPr>
+          <w:p>
+            <w:pPr>
+              <w:spacing w:before="40" w:after="40"/>
+            </w:pPr>
+            <w:r>
+              <w:rPr>
+                <w:szCs w:val="20"/>
+                <w:sz w:val="18"/>
+              </w:rPr>
+              <w:t xml:space="preserve">Students, school administration, parents</w:t>
+            </w:r>
+          </w:p>
+        </w:tc>
+        <w:tc>
+          <w:tcPr>
+            <w:tcW w:w="1750" w:type="dxa"/>
+            <w:tcMar>
+              <w:top w:w="60" w:type="dxa"/>
+              <w:left w:w="90" w:type="dxa"/>
+              <w:bottom w:w="60" w:type="dxa"/>
+              <w:right w:w="90" w:type="dxa"/>
+            </w:tcMar>
+          </w:tcPr>
+          <w:p>
+            <w:pPr>
+              <w:spacing w:before="40" w:after="40"/>
+            </w:pPr>
+            <w:r>
+              <w:rPr>
+                <w:szCs w:val="20"/>
+                <w:sz w:val="18"/>
+              </w:rPr>
+              <w:t xml:space="preserve">RFID attendance; records sent to the administration; email or SMS notice to parents</w:t>
+            </w:r>
+          </w:p>
+        </w:tc>
+        <w:tc>
+          <w:tcPr>
+            <w:tcW w:w="1400" w:type="dxa"/>
+            <w:tcMar>
+              <w:top w:w="60" w:type="dxa"/>
+              <w:left w:w="90" w:type="dxa"/>
+              <w:bottom w:w="60" w:type="dxa"/>
+              <w:right w:w="90" w:type="dxa"/>
+            </w:tcMar>
+          </w:tcPr>
+          <w:p>
+            <w:pPr>
+              <w:spacing w:before="40" w:after="40"/>
+            </w:pPr>
+            <w:r>
+              <w:rPr>
+                <w:szCs w:val="20"/>
+                <w:sz w:val="18"/>
+              </w:rPr>
+              <w:t xml:space="preserve">RFID, IoT connected objects</w:t>
+            </w:r>
+          </w:p>
+        </w:tc>
+        <w:tc>
+          <w:tcPr>
+            <w:tcW w:w="1550" w:type="dxa"/>
+            <w:tcMar>
+              <w:top w:w="60" w:type="dxa"/>
+              <w:left w:w="90" w:type="dxa"/>
+              <w:bottom w:w="60" w:type="dxa"/>
+              <w:right w:w="90" w:type="dxa"/>
+            </w:tcMar>
+          </w:tcPr>
+          <w:p>
+            <w:pPr>
+              <w:spacing w:before="40" w:after="40"/>
+            </w:pPr>
+            <w:r>
+              <w:rPr>
+                <w:szCs w:val="20"/>
+                <w:sz w:val="18"/>
+              </w:rPr>
+              <w:t xml:space="preserve">Identity rests on the card alone; teacher verification not described</w:t>
+            </w:r>
+          </w:p>
+        </w:tc>
+        <w:tc>
+          <w:tcPr>
+            <w:tcW w:w="1190" w:type="dxa"/>
+            <w:tcMar>
+              <w:top w:w="60" w:type="dxa"/>
+              <w:left w:w="90" w:type="dxa"/>
+              <w:bottom w:w="60" w:type="dxa"/>
+              <w:right w:w="90" w:type="dxa"/>
+            </w:tcMar>
+          </w:tcPr>
+          <w:p>
+            <w:pPr>
+              <w:spacing w:before="40" w:after="40"/>
+            </w:pPr>
+            <w:r>
+              <w:rPr>
+                <w:szCs w:val="20"/>
+                <w:sz w:val="18"/>
+              </w:rPr>
+              <w:t xml:space="preserve">Shows that RFID attendance reduces manual recording</w:t>
+            </w:r>
+          </w:p>
+        </w:tc>
+      </w:tr>
+      <w:tr>
+        <w:tc>
+          <w:tcPr>
+            <w:tcW w:w="1450" w:type="dxa"/>
+            <w:tcMar>
+              <w:top w:w="60" w:type="dxa"/>
+              <w:left w:w="90" w:type="dxa"/>
+              <w:bottom w:w="60" w:type="dxa"/>
+              <w:right w:w="90" w:type="dxa"/>
+            </w:tcMar>
+          </w:tcPr>
+          <w:p>
+            <w:pPr>
+              <w:spacing w:before="40" w:after="40"/>
+            </w:pPr>
+            <w:r>
+              <w:rPr>
+                <w:szCs w:val="20"/>
+                <w:sz w:val="18"/>
+              </w:rPr>
+              <w:t xml:space="preserve">Khamaysah et al. (2024), Palestine</w:t>
+            </w:r>
+          </w:p>
+        </w:tc>
+        <w:tc>
+          <w:tcPr>
+            <w:tcW w:w="1300" w:type="dxa"/>
+            <w:tcMar>
+              <w:top w:w="60" w:type="dxa"/>
+              <w:left w:w="90" w:type="dxa"/>
+              <w:bottom w:w="60" w:type="dxa"/>
+              <w:right w:w="90" w:type="dxa"/>
+            </w:tcMar>
+          </w:tcPr>
+          <w:p>
+            <w:pPr>
+              <w:spacing w:before="40" w:after="40"/>
+            </w:pPr>
+            <w:r>
+              <w:rPr>
+                <w:szCs w:val="20"/>
+                <w:sz w:val="18"/>
+              </w:rPr>
+              <w:t xml:space="preserve">Students or employees, administrators</w:t>
+            </w:r>
+          </w:p>
+        </w:tc>
+        <w:tc>
+          <w:tcPr>
+            <w:tcW w:w="1750" w:type="dxa"/>
+            <w:tcMar>
+              <w:top w:w="60" w:type="dxa"/>
+              <w:left w:w="90" w:type="dxa"/>
+              <w:bottom w:w="60" w:type="dxa"/>
+              <w:right w:w="90" w:type="dxa"/>
+            </w:tcMar>
+          </w:tcPr>
+          <w:p>
+            <w:pPr>
+              <w:spacing w:before="40" w:after="40"/>
+            </w:pPr>
+            <w:r>
+              <w:rPr>
+                <w:szCs w:val="20"/>
+                <w:sz w:val="18"/>
+              </w:rPr>
+              <w:t xml:space="preserve">RFID combined with fingerprint at the entrance; central web database</w:t>
+            </w:r>
+          </w:p>
+        </w:tc>
+        <w:tc>
+          <w:tcPr>
+            <w:tcW w:w="1400" w:type="dxa"/>
+            <w:tcMar>
+              <w:top w:w="60" w:type="dxa"/>
+              <w:left w:w="90" w:type="dxa"/>
+              <w:bottom w:w="60" w:type="dxa"/>
+              <w:right w:w="90" w:type="dxa"/>
+            </w:tcMar>
+          </w:tcPr>
+          <w:p>
+            <w:pPr>
+              <w:spacing w:before="40" w:after="40"/>
+            </w:pPr>
+            <w:r>
+              <w:rPr>
+                <w:szCs w:val="20"/>
+                <w:sz w:val="18"/>
+              </w:rPr>
+              <w:t xml:space="preserve">RFID, fingerprint sensor, Wi-Fi modules, web database</w:t>
+            </w:r>
+          </w:p>
+        </w:tc>
+        <w:tc>
+          <w:tcPr>
+            <w:tcW w:w="1550" w:type="dxa"/>
+            <w:tcMar>
+              <w:top w:w="60" w:type="dxa"/>
+              <w:left w:w="90" w:type="dxa"/>
+              <w:bottom w:w="60" w:type="dxa"/>
+              <w:right w:w="90" w:type="dxa"/>
+            </w:tcMar>
+          </w:tcPr>
+          <w:p>
+            <w:pPr>
+              <w:spacing w:before="40" w:after="40"/>
+            </w:pPr>
+            <w:r>
+              <w:rPr>
+                <w:szCs w:val="20"/>
+                <w:sz w:val="18"/>
+              </w:rPr>
+              <w:t xml:space="preserve">Fingerprint authenticates each attendee; session control by a teacher not described; no numerical evaluation reported</w:t>
+            </w:r>
+          </w:p>
+        </w:tc>
+        <w:tc>
+          <w:tcPr>
+            <w:tcW w:w="1190" w:type="dxa"/>
+            <w:tcMar>
+              <w:top w:w="60" w:type="dxa"/>
+              <w:left w:w="90" w:type="dxa"/>
+              <w:bottom w:w="60" w:type="dxa"/>
+              <w:right w:w="90" w:type="dxa"/>
+            </w:tcMar>
+          </w:tcPr>
+          <w:p>
+            <w:pPr>
+              <w:spacing w:before="40" w:after="40"/>
+            </w:pPr>
+            <w:r>
+              <w:rPr>
+                <w:szCs w:val="20"/>
+                <w:sz w:val="18"/>
+              </w:rPr>
+              <w:t xml:space="preserve">Closest combination of RFID and fingerprint</w:t>
+            </w:r>
+          </w:p>
+        </w:tc>
+      </w:tr>
+      <w:tr>
+        <w:tc>
+          <w:tcPr>
+            <w:tcW w:w="1450" w:type="dxa"/>
+            <w:tcMar>
+              <w:top w:w="60" w:type="dxa"/>
+              <w:left w:w="90" w:type="dxa"/>
+              <w:bottom w:w="60" w:type="dxa"/>
+              <w:right w:w="90" w:type="dxa"/>
+            </w:tcMar>
+          </w:tcPr>
+          <w:p>
+            <w:pPr>
+              <w:spacing w:before="40" w:after="40"/>
+            </w:pPr>
+            <w:r>
+              <w:rPr>
+                <w:szCs w:val="20"/>
+                <w:sz w:val="18"/>
+              </w:rPr>
+              <w:t xml:space="preserve">Dellosa (2011), Philippines</w:t>
+            </w:r>
+          </w:p>
+        </w:tc>
+        <w:tc>
+          <w:tcPr>
+            <w:tcW w:w="1300" w:type="dxa"/>
+            <w:tcMar>
+              <w:top w:w="60" w:type="dxa"/>
+              <w:left w:w="90" w:type="dxa"/>
+              <w:bottom w:w="60" w:type="dxa"/>
+              <w:right w:w="90" w:type="dxa"/>
+            </w:tcMar>
+          </w:tcPr>
+          <w:p>
+            <w:pPr>
+              <w:spacing w:before="40" w:after="40"/>
+            </w:pPr>
+            <w:r>
+              <w:rPr>
+                <w:szCs w:val="20"/>
+                <w:sz w:val="18"/>
+              </w:rPr>
+              <w:t xml:space="preserve">Students, school, parents</w:t>
+            </w:r>
+          </w:p>
+        </w:tc>
+        <w:tc>
+          <w:tcPr>
+            <w:tcW w:w="1750" w:type="dxa"/>
+            <w:tcMar>
+              <w:top w:w="60" w:type="dxa"/>
+              <w:left w:w="90" w:type="dxa"/>
+              <w:bottom w:w="60" w:type="dxa"/>
+              <w:right w:w="90" w:type="dxa"/>
+            </w:tcMar>
+          </w:tcPr>
+          <w:p>
+            <w:pPr>
+              <w:spacing w:before="40" w:after="40"/>
+            </w:pPr>
+            <w:r>
+              <w:rPr>
+                <w:szCs w:val="20"/>
+                <w:sz w:val="18"/>
+              </w:rPr>
+              <w:t xml:space="preserve">Campus entry and exit logging; SMS of times, balances, and schedules</w:t>
+            </w:r>
+          </w:p>
+        </w:tc>
+        <w:tc>
+          <w:tcPr>
+            <w:tcW w:w="1400" w:type="dxa"/>
+            <w:tcMar>
+              <w:top w:w="60" w:type="dxa"/>
+              <w:left w:w="90" w:type="dxa"/>
+              <w:bottom w:w="60" w:type="dxa"/>
+              <w:right w:w="90" w:type="dxa"/>
+            </w:tcMar>
+          </w:tcPr>
+          <w:p>
+            <w:pPr>
+              <w:spacing w:before="40" w:after="40"/>
+            </w:pPr>
+            <w:r>
+              <w:rPr>
+                <w:szCs w:val="20"/>
+                <w:sz w:val="18"/>
+              </w:rPr>
+              <w:t xml:space="preserve">Low-frequency RFID, SMS</w:t>
+            </w:r>
+          </w:p>
+        </w:tc>
+        <w:tc>
+          <w:tcPr>
+            <w:tcW w:w="1550" w:type="dxa"/>
+            <w:tcMar>
+              <w:top w:w="60" w:type="dxa"/>
+              <w:left w:w="90" w:type="dxa"/>
+              <w:bottom w:w="60" w:type="dxa"/>
+              <w:right w:w="90" w:type="dxa"/>
+            </w:tcMar>
+          </w:tcPr>
+          <w:p>
+            <w:pPr>
+              <w:spacing w:before="40" w:after="40"/>
+            </w:pPr>
+            <w:r>
+              <w:rPr>
+                <w:szCs w:val="20"/>
+                <w:sz w:val="18"/>
+              </w:rPr>
+              <w:t xml:space="preserve">Campus-level logging; card must be presented at the reader; no biometric verification</w:t>
+            </w:r>
+          </w:p>
+        </w:tc>
+        <w:tc>
+          <w:tcPr>
+            <w:tcW w:w="1190" w:type="dxa"/>
+            <w:tcMar>
+              <w:top w:w="60" w:type="dxa"/>
+              <w:left w:w="90" w:type="dxa"/>
+              <w:bottom w:w="60" w:type="dxa"/>
+              <w:right w:w="90" w:type="dxa"/>
+            </w:tcMar>
+          </w:tcPr>
+          <w:p>
+            <w:pPr>
+              <w:spacing w:before="40" w:after="40"/>
+            </w:pPr>
+            <w:r>
+              <w:rPr>
+                <w:szCs w:val="20"/>
+                <w:sz w:val="18"/>
+              </w:rPr>
+              <w:t xml:space="preserve">Early local use of RFID for student monitoring</w:t>
+            </w:r>
+          </w:p>
+        </w:tc>
+      </w:tr>
+      <w:tr>
+        <w:tc>
+          <w:tcPr>
+            <w:tcW w:w="1450" w:type="dxa"/>
+            <w:tcMar>
+              <w:top w:w="60" w:type="dxa"/>
+              <w:left w:w="90" w:type="dxa"/>
+              <w:bottom w:w="60" w:type="dxa"/>
+              <w:right w:w="90" w:type="dxa"/>
+            </w:tcMar>
+          </w:tcPr>
+          <w:p>
+            <w:pPr>
+              <w:spacing w:before="40" w:after="40"/>
+            </w:pPr>
+            <w:r>
+              <w:rPr>
+                <w:szCs w:val="20"/>
+                <w:sz w:val="18"/>
+              </w:rPr>
+              <w:t xml:space="preserve">Morallo (2015), Philippines</w:t>
+            </w:r>
+          </w:p>
+        </w:tc>
+        <w:tc>
+          <w:tcPr>
+            <w:tcW w:w="1300" w:type="dxa"/>
+            <w:tcMar>
+              <w:top w:w="60" w:type="dxa"/>
+              <w:left w:w="90" w:type="dxa"/>
+              <w:bottom w:w="60" w:type="dxa"/>
+              <w:right w:w="90" w:type="dxa"/>
+            </w:tcMar>
+          </w:tcPr>
+          <w:p>
+            <w:pPr>
+              <w:spacing w:before="40" w:after="40"/>
+            </w:pPr>
+            <w:r>
+              <w:rPr>
+                <w:szCs w:val="20"/>
+                <w:sz w:val="18"/>
+              </w:rPr>
+              <w:t xml:space="preserve">Students, parents, school</w:t>
+            </w:r>
+          </w:p>
+        </w:tc>
+        <w:tc>
+          <w:tcPr>
+            <w:tcW w:w="1750" w:type="dxa"/>
+            <w:tcMar>
+              <w:top w:w="60" w:type="dxa"/>
+              <w:left w:w="90" w:type="dxa"/>
+              <w:bottom w:w="60" w:type="dxa"/>
+              <w:right w:w="90" w:type="dxa"/>
+            </w:tcMar>
+          </w:tcPr>
+          <w:p>
+            <w:pPr>
+              <w:spacing w:before="40" w:after="40"/>
+            </w:pPr>
+            <w:r>
+              <w:rPr>
+                <w:szCs w:val="20"/>
+                <w:sz w:val="18"/>
+              </w:rPr>
+              <w:t xml:space="preserve">Gate entry and exit logging; SMS to parents; web portal</w:t>
+            </w:r>
+          </w:p>
+        </w:tc>
+        <w:tc>
+          <w:tcPr>
+            <w:tcW w:w="1400" w:type="dxa"/>
+            <w:tcMar>
+              <w:top w:w="60" w:type="dxa"/>
+              <w:left w:w="90" w:type="dxa"/>
+              <w:bottom w:w="60" w:type="dxa"/>
+              <w:right w:w="90" w:type="dxa"/>
+            </w:tcMar>
+          </w:tcPr>
+          <w:p>
+            <w:pPr>
+              <w:spacing w:before="40" w:after="40"/>
+            </w:pPr>
+            <w:r>
+              <w:rPr>
+                <w:szCs w:val="20"/>
+                <w:sz w:val="18"/>
+              </w:rPr>
+              <w:t xml:space="preserve">RFID, SMS, VB .NET, PHP, MySQL</w:t>
+            </w:r>
+          </w:p>
+        </w:tc>
+        <w:tc>
+          <w:tcPr>
+            <w:tcW w:w="1550" w:type="dxa"/>
+            <w:tcMar>
+              <w:top w:w="60" w:type="dxa"/>
+              <w:left w:w="90" w:type="dxa"/>
+              <w:bottom w:w="60" w:type="dxa"/>
+              <w:right w:w="90" w:type="dxa"/>
+            </w:tcMar>
+          </w:tcPr>
+          <w:p>
+            <w:pPr>
+              <w:spacing w:before="40" w:after="40"/>
+            </w:pPr>
+            <w:r>
+              <w:rPr>
+                <w:szCs w:val="20"/>
+                <w:sz w:val="18"/>
+              </w:rPr>
+              <w:t xml:space="preserve">Gate-level rather than classroom-level; no biometric verification</w:t>
+            </w:r>
+          </w:p>
+        </w:tc>
+        <w:tc>
+          <w:tcPr>
+            <w:tcW w:w="1190" w:type="dxa"/>
+            <w:tcMar>
+              <w:top w:w="60" w:type="dxa"/>
+              <w:left w:w="90" w:type="dxa"/>
+              <w:bottom w:w="60" w:type="dxa"/>
+              <w:right w:w="90" w:type="dxa"/>
+            </w:tcMar>
+          </w:tcPr>
+          <w:p>
+            <w:pPr>
+              <w:spacing w:before="40" w:after="40"/>
+            </w:pPr>
+            <w:r>
+              <w:rPr>
+                <w:szCs w:val="20"/>
+                <w:sz w:val="18"/>
+              </w:rPr>
+              <w:t xml:space="preserve">Local precedent; L-SIAMS moves recording from the gate to the classroom</w:t>
+            </w:r>
+          </w:p>
+        </w:tc>
+      </w:tr>
+      <w:tr>
+        <w:tc>
+          <w:tcPr>
+            <w:tcW w:w="1450" w:type="dxa"/>
+            <w:tcMar>
+              <w:top w:w="60" w:type="dxa"/>
+              <w:left w:w="90" w:type="dxa"/>
+              <w:bottom w:w="60" w:type="dxa"/>
+              <w:right w:w="90" w:type="dxa"/>
+            </w:tcMar>
+          </w:tcPr>
+          <w:p>
+            <w:pPr>
+              <w:spacing w:before="40" w:after="40"/>
+            </w:pPr>
+            <w:r>
+              <w:rPr>
+                <w:szCs w:val="20"/>
+                <w:sz w:val="18"/>
+              </w:rPr>
+              <w:t xml:space="preserve">L-SIAMS (this study)</w:t>
+            </w:r>
+          </w:p>
+        </w:tc>
+        <w:tc>
+          <w:tcPr>
+            <w:tcW w:w="1300" w:type="dxa"/>
+            <w:tcMar>
+              <w:top w:w="60" w:type="dxa"/>
+              <w:left w:w="90" w:type="dxa"/>
+              <w:bottom w:w="60" w:type="dxa"/>
+              <w:right w:w="90" w:type="dxa"/>
+            </w:tcMar>
+          </w:tcPr>
+          <w:p>
+            <w:pPr>
+              <w:spacing w:before="40" w:after="40"/>
+            </w:pPr>
+            <w:r>
+              <w:rPr>
+                <w:szCs w:val="20"/>
+                <w:sz w:val="18"/>
+              </w:rPr>
+              <w:t xml:space="preserve">Teachers, school and IT administrators, students</w:t>
+            </w:r>
+          </w:p>
+        </w:tc>
+        <w:tc>
+          <w:tcPr>
+            <w:tcW w:w="1750" w:type="dxa"/>
+            <w:tcMar>
+              <w:top w:w="60" w:type="dxa"/>
+              <w:left w:w="90" w:type="dxa"/>
+              <w:bottom w:w="60" w:type="dxa"/>
+              <w:right w:w="90" w:type="dxa"/>
+            </w:tcMar>
+          </w:tcPr>
+          <w:p>
+            <w:pPr>
+              <w:spacing w:before="40" w:after="40"/>
+            </w:pPr>
+            <w:r>
+              <w:rPr>
+                <w:szCs w:val="20"/>
+                <w:sz w:val="18"/>
+              </w:rPr>
+              <w:t xml:space="preserve">Classroom RFID tap-in and tap-out; teacher fingerprint before each session; dashboard; reports; multi-layer security</w:t>
+            </w:r>
+          </w:p>
+        </w:tc>
+        <w:tc>
+          <w:tcPr>
+            <w:tcW w:w="1400" w:type="dxa"/>
+            <w:tcMar>
+              <w:top w:w="60" w:type="dxa"/>
+              <w:left w:w="90" w:type="dxa"/>
+              <w:bottom w:w="60" w:type="dxa"/>
+              <w:right w:w="90" w:type="dxa"/>
+            </w:tcMar>
+          </w:tcPr>
+          <w:p>
+            <w:pPr>
+              <w:spacing w:before="40" w:after="40"/>
+            </w:pPr>
+            <w:r>
+              <w:rPr>
+                <w:szCs w:val="20"/>
+                <w:sz w:val="18"/>
+              </w:rPr>
+              <w:t xml:space="preserve">ESP32, MFRC522, AS608, PHP, SQLite, HTTPS/TLS, LAN only</w:t>
+            </w:r>
+          </w:p>
+        </w:tc>
+        <w:tc>
+          <w:tcPr>
+            <w:tcW w:w="1550" w:type="dxa"/>
+            <w:tcMar>
+              <w:top w:w="60" w:type="dxa"/>
+              <w:left w:w="90" w:type="dxa"/>
+              <w:bottom w:w="60" w:type="dxa"/>
+              <w:right w:w="90" w:type="dxa"/>
+            </w:tcMar>
+          </w:tcPr>
+          <w:p>
+            <w:pPr>
+              <w:spacing w:before="40" w:after="40"/>
+            </w:pPr>
+            <w:r>
+              <w:rPr>
+                <w:szCs w:val="20"/>
+                <w:sz w:val="18"/>
+              </w:rPr>
+              <w:t xml:space="preserve">Evaluated in two classrooms over two days; LAN only</w:t>
+            </w:r>
+          </w:p>
+        </w:tc>
+        <w:tc>
+          <w:tcPr>
+            <w:tcW w:w="1190" w:type="dxa"/>
+            <w:tcMar>
+              <w:top w:w="60" w:type="dxa"/>
+              <w:left w:w="90" w:type="dxa"/>
+              <w:bottom w:w="60" w:type="dxa"/>
+              <w:right w:w="90" w:type="dxa"/>
+            </w:tcMar>
+          </w:tcPr>
+          <w:p>
+            <w:pPr>
+              <w:spacing w:before="40" w:after="40"/>
+            </w:pPr>
+            <w:r>
+              <w:rPr>
+                <w:szCs w:val="20"/>
+                <w:sz w:val="18"/>
+              </w:rPr>
+              <w:t xml:space="preserve">Addresses classroom-level recording, teacher verification, and security together</w:t>
+            </w:r>
+          </w:p>
+        </w:tc>
+      </w:tr>
+    </w:tbl>
+    <w:p>
+      <w:pPr>
+        <w:spacing w:line="480" w:lineRule="auto"/>
+        <w:ind w:left="284" w:firstLine="720"/>
+        <w:jc w:val="both"/>
+      </w:pPr>
+      <w:r>
+        <w:t xml:space="preserve"/>
+      </w:r>
+    </w:p>
+    <w:p>
+      <w:pPr>
+        <w:spacing w:line="480" w:lineRule="auto"/>
+        <w:ind w:left="284" w:firstLine="720"/>
+        <w:jc w:val="both"/>
+      </w:pPr>
+      <w:r>
+        <w:t xml:space="preserve">As Table 1 shows, the reviewed systems recorded attendance through RFID, and the two local systems logged students at the school gate or campus entrance with SMS notification to parents. Only Khamaysah et al. (2024) combined RFID with fingerprint authentication, and none of the reviewed systems, as described by their authors, required the teacher to be verified before attendance could be recorded or reported security controls such as encrypted communication, device authentication, and audit logging. L-SIAMS was developed to combine these elements at the classroom level.</w:t>
       </w:r>
     </w:p>
     <w:p>
@@ -4680,7 +5692,7 @@
         <w:jc w:val="both"/>
       </w:pPr>
       <w:r>
-        <w:t xml:space="preserve">The stakeholders of the system were the school administration, the teachers, the IT administrators, and the students. The requirements were gathered through [insert the methods used, for example interviews with the school principal and the IT administrator and observation of the existing attendance process, with their dates]. The functional, non-functional, hardware, and software requirements identified are listed below; their implementation is traced in Chapter V, Table 12.</w:t>
+        <w:t xml:space="preserve">The stakeholders of the system were the school administration, the teachers, the IT administrators, and the students. The requirements were gathered through [insert the methods used, for example interviews with the school principal and the IT administrator and observation of the existing attendance process, with their dates]. The functional, non-functional, hardware, and software requirements identified are listed below; their implementation is traced in Chapter V, Table 13.</w:t>
       </w:r>
     </w:p>
     <w:p>
@@ -4901,7 +5913,7 @@
         <w:t xml:space="preserve">Performance.</w:t>
       </w:r>
       <w:r>
-        <w:t xml:space="preserve"> A response time of less than two seconds for recording attendance (Table 7).</w:t>
+        <w:t xml:space="preserve"> A response time of less than two seconds for recording attendance (Table 8).</w:t>
       </w:r>
     </w:p>
     <w:p>
@@ -5371,7 +6383,7 @@
         <w:jc w:val="both"/>
       </w:pPr>
       <w:r>
-        <w:t xml:space="preserve">Penetration testing using Wireshark and the Kali Linux toolset (Hydra and Nmap) was limited strictly to authorized and owned Local Area Network (LAN) devices for academic and evaluation purposes only. Wireshark was used for packet inspection and verification of encrypted traffic between the IoT devices and the server. Nmap was used for port and service discovery to identify unnecessary open ports and evaluate network exposure within the LAN. Hydra was used to conduct controlled brute-force login attempts to assess the effectiveness of the account lockout and rate-limiting mechanisms against unauthorized access. No external systems or unauthorized networks were targeted. The test plan is presented in Table 1.</w:t>
+        <w:t xml:space="preserve">Penetration testing using Wireshark and the Kali Linux toolset (Hydra and Nmap) was limited strictly to authorized and owned Local Area Network (LAN) devices for academic and evaluation purposes only. Wireshark was used for packet inspection and verification of encrypted traffic between the IoT devices and the server. Nmap was used for port and service discovery to identify unnecessary open ports and evaluate network exposure within the LAN. Hydra was used to conduct controlled brute-force login attempts to assess the effectiveness of the account lockout and rate-limiting mechanisms against unauthorized access. No external systems or unauthorized networks were targeted. The test plan is presented in Table 2.</w:t>
       </w:r>
     </w:p>
     <w:p>
@@ -5392,7 +6404,7 @@
           <w:bCs/>
         </w:rPr>
         <w:lastRenderedPageBreak/>
-        <w:t>Table 1</w:t>
+        <w:t>Table 2</w:t>
       </w:r>
     </w:p>
     <w:p>
@@ -6508,7 +7520,7 @@
         <w:jc w:val="both"/>
       </w:pPr>
       <w:r>
-        <w:t xml:space="preserve">The respondents and their role in the evaluation are shown in Table 2. A total of 64 respondents took part: 51 students, 10 teachers, 2 IT administrators, and 1 school administrator.</w:t>
+        <w:t xml:space="preserve">The respondents and their role in the evaluation are shown in Table 3. A total of 64 respondents took part: 51 students, 10 teachers, 2 IT administrators, and 1 school administrator.</w:t>
       </w:r>
     </w:p>
     <w:p>
@@ -6531,7 +7543,7 @@
           <w:b/>
           <w:bCs/>
         </w:rPr>
-        <w:t>Table 2</w:t>
+        <w:t>Table 3</w:t>
       </w:r>
     </w:p>
     <w:p>
@@ -7069,7 +8081,7 @@
         <w:jc w:val="both"/>
       </w:pPr>
       <w:r>
-        <w:t xml:space="preserve">For the security component, Wireshark, Hydra and Nmap were used in controlled testing, together with the system’s security and audit logs. The users’ evaluation was gathered with two instruments answered on the five-point Likert scale in Table 3: the Security Evaluation Questionnaire, adapted from a published study [Insert citation of the source study], and the User Acceptance Testing (UAT) form.</w:t>
+        <w:t xml:space="preserve">For the security component, Wireshark, Hydra and Nmap were used in controlled testing, together with the system’s security and audit logs. The users’ evaluation was gathered with two instruments answered on the five-point Likert scale in Table 4: the Security Evaluation Questionnaire, adapted from a published study [Insert citation of the source study], and the User Acceptance Testing (UAT) form.</w:t>
       </w:r>
     </w:p>
     <w:p>
@@ -7082,7 +8094,7 @@
           <w:b/>
           <w:bCs/>
         </w:rPr>
-        <w:t>Table 3</w:t>
+        <w:t>Table 4</w:t>
       </w:r>
     </w:p>
     <w:p>
@@ -7543,7 +8555,7 @@
         <w:jc w:val="both"/>
       </w:pPr>
       <w:r>
-        <w:t xml:space="preserve">Each evaluation objective was measured with corresponding metrics and instruments. Processing time, queue length and efficiency (Objective 4.1) were measured from the system logs, stopwatch timing of the manual roll call, and observation. Accuracy (Objective 4.2) was measured through record comparison. Usability, performance and reliability (Objective 4.3) were measured with the UAT form, the system response time, the recording time and the completeness of the session records, and the effectiveness of the security controls under ISO/IEC 27001 and the CIA Triad (also Objective 4.3) with the Security Evaluation Questionnaire and the Part D checklist. The penetration testing (Objective 5) used the test procedures in Table 1 and the security logs.</w:t>
+        <w:t xml:space="preserve">Each evaluation objective was measured with corresponding metrics and instruments. Processing time, queue length and efficiency (Objective 4.1) were measured from the system logs, stopwatch timing of the manual roll call, and observation. Accuracy (Objective 4.2) was measured through record comparison. Usability, performance and reliability (Objective 4.3) were measured with the UAT form, the system response time, the recording time and the completeness of the session records, and the effectiveness of the security controls under ISO/IEC 27001 and the CIA Triad (also Objective 4.3) with the Security Evaluation Questionnaire and the Part D checklist. The penetration testing (Objective 5) used the test procedures in Table 2 and the security logs.</w:t>
       </w:r>
     </w:p>
     <w:p>
@@ -7586,7 +8598,7 @@
           <w:b/>
           <w:bCs/>
         </w:rPr>
-        <w:t>Table 4</w:t>
+        <w:t>Table 5</w:t>
       </w:r>
     </w:p>
     <w:p>
@@ -8214,7 +9226,7 @@
           <w:bCs/>
         </w:rPr>
         <w:lastRenderedPageBreak/>
-        <w:t>Table 5</w:t>
+        <w:t>Table 6</w:t>
       </w:r>
     </w:p>
     <w:p>
@@ -8943,7 +9955,7 @@
         <w:jc w:val="both"/>
       </w:pPr>
       <w:r>
-        <w:t xml:space="preserve">The penetration tests in Table 1 were performed on owned devices within the school LAN. Every refused request, failed sign-in and override was recorded by the system in its security log, which was also used as evidence.</w:t>
+        <w:t xml:space="preserve">The penetration tests in Table 2 were performed on owned devices within the school LAN. Every refused request, failed sign-in and override was recorded by the system in its security log, which was also used as evidence.</w:t>
       </w:r>
     </w:p>
     <w:p>
@@ -9231,7 +10243,7 @@
         <w:jc w:val="both"/>
       </w:pPr>
       <w:r>
-        <w:t xml:space="preserve">The results were interpreted against the success criteria in Table 7, and mean scores with the ranges in Table 6. The system was considered acceptable if it met the criteria for accuracy, teacher authentication, security testing, and the users’ evaluation of the security controls and of the system as a whole. Criteria that could not be measured during deployment are reported as such in Chapter V.</w:t>
+        <w:t xml:space="preserve">The results were interpreted against the success criteria in Table 8, and mean scores with the ranges in Table 7. The system was considered acceptable if it met the criteria for accuracy, teacher authentication, security testing, and the users’ evaluation of the security controls and of the system as a whole. Criteria that could not be measured during deployment are reported as such in Chapter V.</w:t>
       </w:r>
     </w:p>
     <w:p>
@@ -9244,7 +10256,7 @@
           <w:b/>
           <w:bCs/>
         </w:rPr>
-        <w:t>Table 6</w:t>
+        <w:t>Table 7</w:t>
       </w:r>
     </w:p>
     <w:p>
@@ -9684,7 +10696,7 @@
           <w:b/>
           <w:bCs/>
         </w:rPr>
-        <w:t>Table 7</w:t>
+        <w:t>Table 8</w:t>
       </w:r>
     </w:p>
     <w:p>
@@ -10701,7 +11713,7 @@
         <w:jc w:val="both"/>
       </w:pPr>
       <w:r>
-        <w:t xml:space="preserve">The security criteria in Table 7 are organized under the CIA framework, following the guidance of ISO/IEC 27001. Confidentiality was assessed through the absence of readable sensitive data in captured traffic and the rejection of unauthorized requests. Integrity was assessed through the accuracy of attendance records, the completeness of the audit trail, and the system’s refusal of forged and replayed requests. Availability was assessed through Part C of the questionnaire, the availability controls of the Part D checklist, and the terminals’ recovery from lost connections. The study applied ISO/IEC 27001 as a guiding framework at the level of confidentiality, integrity and availability, not as a certification audit.</w:t>
+        <w:t xml:space="preserve">The security criteria in Table 8 are organized under the CIA framework, following the guidance of ISO/IEC 27001. Confidentiality was assessed through the absence of readable sensitive data in captured traffic and the rejection of unauthorized requests. Integrity was assessed through the accuracy of attendance records, the completeness of the audit trail, and the system’s refusal of forged and replayed requests. Availability was assessed through Part C of the questionnaire, the availability controls of the Part D checklist, and the terminals’ recovery from lost connections. The study applied ISO/IEC 27001 as a guiding framework at the level of confidentiality, integrity and availability, not as a certification audit.</w:t>
       </w:r>
     </w:p>
     <w:p>
@@ -10711,7 +11723,7 @@
         <w:jc w:val="both"/>
       </w:pPr>
       <w:r>
-        <w:t xml:space="preserve">The success criterion for the Security Evaluation Questionnaire and the UAT is a mean of 3.40 or above, which Table 6 interprets as High. Each obtained mean is reported with its verbal interpretation, so that a result in the Very High band is recorded as such. The criterion is set above the midpoint of the scale, because a threshold that a merely Moderate rating could satisfy would not distinguish an acceptable system from an indifferent one.</w:t>
+        <w:t xml:space="preserve">The success criterion for the Security Evaluation Questionnaire and the UAT is a mean of 3.40 or above, which Table 7 interprets as High. Each obtained mean is reported with its verbal interpretation, so that a result in the Very High band is recorded as such. The criterion is set above the midpoint of the scale, because a threshold that a merely Moderate rating could satisfy would not distinguish an acceptable system from an indifferent one.</w:t>
       </w:r>
     </w:p>
     <w:p>
@@ -11851,7 +12863,7 @@
         <w:jc w:val="both"/>
       </w:pPr>
       <w:r>
-        <w:t>The server validates every device request through a fixed six-step sequence, shown in Table 8. Each step has its own failure code, and every failure is written to the security log. The codes returned to the caller are deliberately coarse, so that a rejected request does not reveal which condition failed and therefore does not help an attacker map the system’s defences, while the log retains the precise reason for the administrator.</w:t>
+        <w:t>The server validates every device request through a fixed six-step sequence, shown in Table 9. Each step has its own failure code, and every failure is written to the security log. The codes returned to the caller are deliberately coarse, so that a rejected request does not reveal which condition failed and therefore does not help an attacker map the system’s defences, while the log retains the precise reason for the administrator.</w:t>
       </w:r>
     </w:p>
     <w:p>
@@ -11878,7 +12890,7 @@
           <w:b/>
           <w:bCs/>
         </w:rPr>
-        <w:t>Table 8</w:t>
+        <w:t>Table 9</w:t>
       </w:r>
     </w:p>
     <w:p>
@@ -12949,7 +13961,7 @@
         <w:jc w:val="both"/>
       </w:pPr>
       <w:r>
-        <w:t>Monitoring is implemented through two complementary records. The audit log records ordinary administrative and attendance activity for accountability. The security log records events that carry a security meaning, each classified by severity and carried through a resolution workflow so that an administrator can mark an entry as investigating, resolved, or a false positive rather than merely observing it. The system records thirty-three distinct security event types, grouped in Table 9.</w:t>
+        <w:t>Monitoring is implemented through two complementary records. The audit log records ordinary administrative and attendance activity for accountability. The security log records events that carry a security meaning, each classified by severity and carried through a resolution workflow so that an administrator can mark an entry as investigating, resolved, or a false positive rather than merely observing it. The system records thirty-three distinct security event types, grouped in Table 10.</w:t>
       </w:r>
     </w:p>
     <w:p>
@@ -12972,7 +13984,7 @@
           <w:b/>
           <w:bCs/>
         </w:rPr>
-        <w:t>Table 9</w:t>
+        <w:t>Table 10</w:t>
       </w:r>
     </w:p>
     <w:p>
@@ -13552,7 +14564,7 @@
         <w:jc w:val="both"/>
       </w:pPr>
       <w:r>
-        <w:t>The system adopts a structured STRIDE-based threat model to identify and address common security threats. Table 10 maps each threat category to the specific controls implemented in the system.</w:t>
+        <w:t>The system adopts a structured STRIDE-based threat model to identify and address common security threats. Table 11 maps each threat category to the specific controls implemented in the system.</w:t>
       </w:r>
     </w:p>
     <w:p>
@@ -13566,7 +14578,7 @@
           <w:bCs/>
         </w:rPr>
         <w:lastRenderedPageBreak/>
-        <w:t>Table 10</w:t>
+        <w:t>Table 11</w:t>
       </w:r>
     </w:p>
     <w:p>
@@ -14321,7 +15333,7 @@
           <w:b/>
           <w:bCs/>
         </w:rPr>
-        <w:t>Table 11</w:t>
+        <w:t>Table 12</w:t>
       </w:r>
     </w:p>
     <w:p>
@@ -15486,7 +16498,7 @@
         <w:jc w:val="both"/>
       </w:pPr>
       <w:r>
-        <w:t>Figure 17 shows the security event log, in which each recorded event carries its type, severity, source address, and resolution state, implementing the monitoring layer described in Section 4.8 and Table 9.</w:t>
+        <w:t>Figure 17 shows the security event log, in which each recorded event carries its type, severity, source address, and resolution state, implementing the monitoring layer described in Section 4.8 and Table 10.</w:t>
       </w:r>
     </w:p>
     <w:p>
@@ -15620,7 +16632,7 @@
         <w:jc w:val="both"/>
       </w:pPr>
       <w:r>
-        <w:t>Figure 18 shows the audit trail, which records administrative and attendance activity for accountability and provides the non-repudiation control mapped in Table 10.</w:t>
+        <w:t>Figure 18 shows the audit trail, which records administrative and attendance activity for accountability and provides the non-repudiation control mapped in Table 11.</w:t>
       </w:r>
     </w:p>
     <w:p>
@@ -16529,7 +17541,7 @@
         <w:jc w:val="both"/>
       </w:pPr>
       <w:r>
-        <w:t>This section presents the results of the penetration testing described in Section 4.10. The tests were performed from a Kali Linux host on the same Local Area Network as the server, and were limited strictly to the owned and authorized system. Each test corresponds to a threat identified in the security plan (Table 1) and is presented here as evidence that the associated control operates as designed.</w:t>
+        <w:t>This section presents the results of the penetration testing described in Section 4.10. The tests were performed from a Kali Linux host on the same Local Area Network as the server, and were limited strictly to the owned and authorized system. Each test corresponds to a threat identified in the security plan (Table 2) and is presented here as evidence that the associated control operates as designed.</w:t>
       </w:r>
     </w:p>
     <w:p>
@@ -16879,7 +17891,7 @@
         <w:t xml:space="preserve">Summary. </w:t>
       </w:r>
       <w:r>
-        <w:t>No vulnerabilities classified as High or Critical under the CVSS scale (Table 11) were identified during testing. Every security-relevant action performed during the tests produced a corresponding entry in the audit and security logs, satisfying the log-monitoring criterion of the security plan.</w:t>
+        <w:t>No vulnerabilities classified as High or Critical under the CVSS scale (Table 12) were identified during testing. Every security-relevant action performed during the tests produced a corresponding entry in the audit and security logs, satisfying the log-monitoring criterion of the security plan.</w:t>
       </w:r>
     </w:p>
     <w:p>
@@ -16948,7 +17960,7 @@
         <w:jc w:val="both"/>
       </w:pPr>
       <w:r>
-        <w:t xml:space="preserve">The requirements identified in Chapter I were traced to the features implemented in the deployed system. Table 12 shows that every requirement under Objectives 1 to 3 was implemented and was exercised or evidenced during deployment.</w:t>
+        <w:t xml:space="preserve">The requirements identified in Chapter I were traced to the features implemented in the deployed system. Table 13 shows that every requirement under Objectives 1 to 3 was implemented and was exercised or evidenced during deployment.</w:t>
       </w:r>
     </w:p>
     <w:p>
@@ -16961,7 +17973,7 @@
           <w:b/>
           <w:bCs/>
         </w:rPr>
-        <w:t xml:space="preserve">Table 12</w:t>
+        <w:t xml:space="preserve">Table 13</w:t>
       </w:r>
     </w:p>
     <w:p>
@@ -17148,7 +18160,7 @@
                 <w:sz w:val="20"/>
                 <w:szCs w:val="20"/>
               </w:rPr>
-              <w:t xml:space="preserve">117 students tapped in during the 19 sessions (Table 19)</w:t>
+              <w:t xml:space="preserve">117 students tapped in during the 19 sessions (Table 20)</w:t>
             </w:r>
           </w:p>
         </w:tc>
@@ -17219,7 +18231,7 @@
                 <w:sz w:val="20"/>
                 <w:szCs w:val="20"/>
               </w:rPr>
-              <w:t xml:space="preserve">18 of 18 enrolled-teacher sign-ins verified (Table 16)</w:t>
+              <w:t xml:space="preserve">18 of 18 enrolled-teacher sign-ins verified (Table 17)</w:t>
             </w:r>
           </w:p>
         </w:tc>
@@ -17290,7 +18302,7 @@
                 <w:sz w:val="20"/>
                 <w:szCs w:val="20"/>
               </w:rPr>
-              <w:t xml:space="preserve">562 complete records (Table 19)</w:t>
+              <w:t xml:space="preserve">562 complete records (Table 20)</w:t>
             </w:r>
           </w:p>
         </w:tc>
@@ -17574,7 +18586,7 @@
                 <w:sz w:val="20"/>
                 <w:szCs w:val="20"/>
               </w:rPr>
-              <w:t xml:space="preserve">TLS test suite; Table 14</w:t>
+              <w:t xml:space="preserve">TLS test suite; Table 15</w:t>
             </w:r>
           </w:p>
         </w:tc>
@@ -17645,7 +18657,7 @@
                 <w:sz w:val="20"/>
                 <w:szCs w:val="20"/>
               </w:rPr>
-              <w:t xml:space="preserve">19 failed sign-ins refused (Table 15)</w:t>
+              <w:t xml:space="preserve">19 failed sign-ins refused (Table 16)</w:t>
             </w:r>
           </w:p>
         </w:tc>
@@ -17716,7 +18728,7 @@
                 <w:sz w:val="20"/>
                 <w:szCs w:val="20"/>
               </w:rPr>
-              <w:t xml:space="preserve">Table 14</w:t>
+              <w:t xml:space="preserve">Table 15</w:t>
             </w:r>
           </w:p>
         </w:tc>
@@ -17787,7 +18799,7 @@
                 <w:sz w:val="20"/>
                 <w:szCs w:val="20"/>
               </w:rPr>
-              <w:t xml:space="preserve">Every security event logged (Table 15)</w:t>
+              <w:t xml:space="preserve">Every security event logged (Table 16)</w:t>
             </w:r>
           </w:p>
         </w:tc>
@@ -17858,7 +18870,7 @@
                 <w:sz w:val="20"/>
                 <w:szCs w:val="20"/>
               </w:rPr>
-              <w:t xml:space="preserve">2 session hijack attempts detected (Table 15)</w:t>
+              <w:t xml:space="preserve">2 session hijack attempts detected (Table 16)</w:t>
             </w:r>
           </w:p>
         </w:tc>
@@ -17929,7 +18941,7 @@
                 <w:sz w:val="20"/>
                 <w:szCs w:val="20"/>
               </w:rPr>
-              <w:t xml:space="preserve">4 invalid device claims and 27 replayed or expired requests rejected (Table 15)</w:t>
+              <w:t xml:space="preserve">4 invalid device claims and 27 replayed or expired requests rejected (Table 16)</w:t>
             </w:r>
           </w:p>
         </w:tc>
@@ -17986,7 +18998,7 @@
         <w:jc w:val="both"/>
       </w:pPr>
       <w:r>
-        <w:t xml:space="preserve">Table 13 lists the modules of the completed system, their status, and the evidence that each was developed and used.</w:t>
+        <w:t xml:space="preserve">Table 14 lists the modules of the completed system, their status, and the evidence that each was developed and used.</w:t>
       </w:r>
     </w:p>
     <w:p>
@@ -17999,7 +19011,7 @@
           <w:b/>
           <w:bCs/>
         </w:rPr>
-        <w:t xml:space="preserve">Table 13</w:t>
+        <w:t xml:space="preserve">Table 14</w:t>
       </w:r>
     </w:p>
     <w:p>
@@ -18257,7 +19269,7 @@
                 <w:sz w:val="20"/>
                 <w:szCs w:val="20"/>
               </w:rPr>
-              <w:t xml:space="preserve">10 sessions by fingerprint, 9 by password failover (Table 16)</w:t>
+              <w:t xml:space="preserve">10 sessions by fingerprint, 9 by password failover (Table 17)</w:t>
             </w:r>
           </w:p>
         </w:tc>
@@ -18328,7 +19340,7 @@
                 <w:sz w:val="20"/>
                 <w:szCs w:val="20"/>
               </w:rPr>
-              <w:t xml:space="preserve">562 records (Table 19)</w:t>
+              <w:t xml:space="preserve">562 records (Table 20)</w:t>
             </w:r>
           </w:p>
         </w:tc>
@@ -18541,7 +19553,7 @@
                 <w:sz w:val="20"/>
                 <w:szCs w:val="20"/>
               </w:rPr>
-              <w:t xml:space="preserve">Tables 14–15</w:t>
+              <w:t xml:space="preserve">Tables 15–16</w:t>
             </w:r>
           </w:p>
         </w:tc>
@@ -18647,7 +19659,7 @@
         <w:jc w:val="both"/>
       </w:pPr>
       <w:r>
-        <w:t xml:space="preserve">During development, the transport-security test suite returned 40 passing assertions, and the concurrency and correctness suite verified that simultaneous taps of the same card produce a single record. The penetration testing of Objective 5 was then performed from a Kali Linux host on the school’s Local Area Network (LAN), following the security plan in Table 1; the tests are described with their screenshots in Section 4.13.3. Their results are summarized in Table 14, and the security events that the system recorded during the two days of deployment are presented in Table 15 and Figure 30.</w:t>
+        <w:t xml:space="preserve">During development, the transport-security test suite returned 40 passing assertions, and the concurrency and correctness suite verified that simultaneous taps of the same card produce a single record. The penetration testing of Objective 5 was then performed from a Kali Linux host on the school’s Local Area Network (LAN), following the security plan in Table 2; the tests are described with their screenshots in Section 4.13.3. Their results are summarized in Table 15, and the security events that the system recorded during the two days of deployment are presented in Table 16 and Figure 30.</w:t>
       </w:r>
     </w:p>
     <w:p>
@@ -18660,7 +19672,7 @@
           <w:b/>
           <w:bCs/>
         </w:rPr>
-        <w:t xml:space="preserve">Table 14</w:t>
+        <w:t xml:space="preserve">Table 15</w:t>
       </w:r>
     </w:p>
     <w:p>
@@ -19290,7 +20302,7 @@
           <w:i/>
           <w:sz w:val="20"/>
         </w:rPr>
-        <w:t xml:space="preserve">Note. The tests follow the security plan in Table 1. Figures 24 to 29 are presented in Section 4.13.3.</w:t>
+        <w:t xml:space="preserve">Note. The tests follow the security plan in Table 2. Figures 24 to 29 are presented in Section 4.13.3.</w:t>
       </w:r>
     </w:p>
     <w:p>
@@ -19313,7 +20325,7 @@
           <w:b/>
           <w:bCs/>
         </w:rPr>
-        <w:t xml:space="preserve">Table 15</w:t>
+        <w:t xml:space="preserve">Table 16</w:t>
       </w:r>
     </w:p>
     <w:p>
@@ -20142,7 +21154,7 @@
           <w:b/>
           <w:bCs/>
         </w:rPr>
-        <w:t xml:space="preserve">Table 16</w:t>
+        <w:t xml:space="preserve">Table 17</w:t>
       </w:r>
     </w:p>
     <w:p>
@@ -20508,7 +21520,7 @@
         <w:jc w:val="both"/>
       </w:pPr>
       <w:r>
-        <w:t xml:space="preserve">All five scenarios of the security plan passed, and no vulnerability classified as High or Critical under the Common Vulnerability Scoring System (CVSS) scale in Table 11 was identified. Each attack was stopped by a different control: signature, timestamp and nonce checks rejected forged and replayed terminal requests, account lockout and rate limiting refused password guessing, and session binding detected the reuse of a session from another client. Every fingerprint sign-in by an enrolled teacher was verified, meeting the 95% authentication criterion, while scans that matched no active enrolment and attempts to open a class a teacher was not scheduled to teach were refused. These results support Objective 5 within the scenarios tested; because the testing was controlled, they do not cover every real-world attack, as stated in the Scope and Limitations.</w:t>
+        <w:t xml:space="preserve">All five scenarios of the security plan passed, and no vulnerability classified as High or Critical under the Common Vulnerability Scoring System (CVSS) scale in Table 12 was identified. Each attack was stopped by a different control: signature, timestamp and nonce checks rejected forged and replayed terminal requests, account lockout and rate limiting refused password guessing, and session binding detected the reuse of a session from another client. Every fingerprint sign-in by an enrolled teacher was verified, meeting the 95% authentication criterion, while scans that matched no active enrolment and attempts to open a class a teacher was not scheduled to teach were refused. These results support Objective 5 within the scenarios tested; because the testing was controlled, they do not cover every real-world attack, as stated in the Scope and Limitations.</w:t>
       </w:r>
     </w:p>
     <w:p>
@@ -20542,7 +21554,7 @@
         <w:jc w:val="both"/>
       </w:pPr>
       <w:r>
-        <w:t xml:space="preserve">Table 17 presents the recording time of the five sessions in which a class queued at the terminal. Sessions with fewer than 10 taps were excluded because students arrived one at a time rather than in a queue.</w:t>
+        <w:t xml:space="preserve">Table 18 presents the recording time of the five sessions in which a class queued at the terminal. Sessions with fewer than 10 taps were excluded because students arrived one at a time rather than in a queue.</w:t>
       </w:r>
     </w:p>
     <w:p>
@@ -20555,7 +21567,7 @@
           <w:b/>
           <w:bCs/>
         </w:rPr>
-        <w:t xml:space="preserve">Table 17</w:t>
+        <w:t xml:space="preserve">Table 18</w:t>
       </w:r>
     </w:p>
     <w:p>
@@ -21707,7 +22719,7 @@
         <w:jc w:val="both"/>
       </w:pPr>
       <w:r>
-        <w:t xml:space="preserve">Figure 31 shows that the median interval between taps ranged from 2.0 to 6.0 seconds in the five queue sessions, around a mean of 4.10 seconds per student. Table 18 and Figure 32 compare this result with the manual roll call.</w:t>
+        <w:t xml:space="preserve">Figure 31 shows that the median interval between taps ranged from 2.0 to 6.0 seconds in the five queue sessions, around a mean of 4.10 seconds per student. Table 19 and Figure 32 compare this result with the manual roll call.</w:t>
       </w:r>
     </w:p>
     <w:p>
@@ -21720,7 +22732,7 @@
           <w:b/>
           <w:bCs/>
         </w:rPr>
-        <w:t xml:space="preserve">Table 18</w:t>
+        <w:t xml:space="preserve">Table 19</w:t>
       </w:r>
     </w:p>
     <w:p>
@@ -22311,7 +23323,7 @@
           <w:b/>
           <w:bCs/>
         </w:rPr>
-        <w:t xml:space="preserve">Table 19</w:t>
+        <w:t xml:space="preserve">Table 20</w:t>
       </w:r>
     </w:p>
     <w:p>
@@ -23196,7 +24208,7 @@
           <w:b/>
           <w:bCs/>
         </w:rPr>
-        <w:t xml:space="preserve">Table 20</w:t>
+        <w:t xml:space="preserve">Table 21</w:t>
       </w:r>
     </w:p>
     <w:p>
@@ -23696,7 +24708,7 @@
           <w:b/>
           <w:bCs/>
         </w:rPr>
-        <w:t xml:space="preserve">Table 21</w:t>
+        <w:t xml:space="preserve">Table 22</w:t>
       </w:r>
     </w:p>
     <w:p>
@@ -24843,7 +25855,7 @@
           <w:b/>
           <w:bCs/>
         </w:rPr>
-        <w:t xml:space="preserve">Table 22</w:t>
+        <w:t xml:space="preserve">Table 23</w:t>
       </w:r>
     </w:p>
     <w:p>
@@ -25126,7 +26138,7 @@
                 <w:sz w:val="20"/>
                 <w:szCs w:val="20"/>
               </w:rPr>
-              <w:t xml:space="preserve">Controls restating Table 7 criteria rated Yes</w:t>
+              <w:t xml:space="preserve">Controls restating Table 8 criteria rated Yes</w:t>
             </w:r>
           </w:p>
         </w:tc>
@@ -25217,7 +26229,7 @@
         <w:jc w:val="both"/>
       </w:pPr>
       <w:r>
-        <w:t xml:space="preserve">Objective 4.3 also called for the assessment of usability, performance and reliability using measurable indicators. Usability was measured with the User Acceptance Testing (UAT) form: ease of use was rated 5.00 and the user interface 4.92, both Very High (Table 23). Performance was indicated by the recording time of 4.10 seconds per student (Table 17) and by the UAT rating for responsiveness, 4.85. The measured response time of the system was 11.7 milliseconds, well within the criterion of less than two seconds in Table 7. Reliability was indicated by the completeness of the records: every one of the 562 records in the 19 class sessions received a final status, the terminals reconnected after 15 lost connections without losing a tap, and the staff rated accuracy 4.85 and Availability 4.56. Because no tap was made while a terminal was offline, the offline synchronization was not exercised and the data synchronization criterion in Table 7 could not be measured.</w:t>
+        <w:t xml:space="preserve">Objective 4.3 also called for the assessment of usability, performance and reliability using measurable indicators. Usability was measured with the User Acceptance Testing (UAT) form: ease of use was rated 5.00 and the user interface 4.92, both Very High (Table 24). Performance was indicated by the recording time of 4.10 seconds per student (Table 18) and by the UAT rating for responsiveness, 4.85. The measured response time of the system was 11.7 milliseconds, well within the criterion of less than two seconds in Table 8. Reliability was indicated by the completeness of the records: every one of the 562 records in the 19 class sessions received a final status, the terminals reconnected after 15 lost connections without losing a tap, and the staff rated accuracy 4.85 and Availability 4.56. Because no tap was made while a terminal was offline, the offline synchronization was not exercised and the data synchronization criterion in Table 8 could not be measured.</w:t>
       </w:r>
     </w:p>
     <w:p>
@@ -25262,7 +26274,7 @@
           <w:b/>
           <w:bCs/>
         </w:rPr>
-        <w:t xml:space="preserve">Table 23</w:t>
+        <w:t xml:space="preserve">Table 24</w:t>
       </w:r>
     </w:p>
     <w:p>
@@ -26162,7 +27174,7 @@
         <w:jc w:val="both"/>
       </w:pPr>
       <w:r>
-        <w:t xml:space="preserve">As Table 23 and Figure 35 show, the 13 staff accepted the system: every UAT criterion was rated Very High and the grand mean was 4.86, above the 3.40 criterion, with no rating below Agree. Teachers asked for a beep confirming that their fingerprint was recognized and for a quick user guide for faculty. In addition, the staff rated using L-SIAMS compared with the manual method at 4.96 (Form 1, Part E) and the students rated using the terminal at 4.26 (Form 2, Part B). After the evaluation, the terminals were removed from the classrooms, and the system is currently not in use at TAPS.</w:t>
+        <w:t xml:space="preserve">As Table 24 and Figure 35 show, the 13 staff accepted the system: every UAT criterion was rated Very High and the grand mean was 4.86, above the 3.40 criterion, with no rating below Agree. Teachers asked for a beep confirming that their fingerprint was recognized and for a quick user guide for faculty. In addition, the staff rated using L-SIAMS compared with the manual method at 4.96 (Form 1, Part E) and the students rated using the terminal at 4.26 (Form 2, Part B). After the evaluation, the terminals were removed from the classrooms, and the system is currently not in use at TAPS.</w:t>
       </w:r>
     </w:p>
     <w:p>
@@ -26391,7 +27403,7 @@
         <w:jc w:val="both"/>
       </w:pPr>
       <w:r>
-        <w:t xml:space="preserve">3. Implementation of the security mechanisms (Objective 3). Encrypted communication over HTTPS/TLS, authentication with role-based access control and account lockout, the network address allowlist, audit and security logging, application-level protections and device authentication with signed requests were implemented. The transport-security test suite returned 40 passing assertions. During deployment the system refused and logged 19 failed sign-ins, 27 expired or replayed requests and 4 invalid device claims, and it detected 2 session hijack attempts (Tables 14 and 15).</w:t>
+        <w:t xml:space="preserve">3. Implementation of the security mechanisms (Objective 3). Encrypted communication over HTTPS/TLS, authentication with role-based access control and account lockout, the network address allowlist, audit and security logging, application-level protections and device authentication with signed requests were implemented. The transport-security test suite returned 40 passing assertions. During deployment the system refused and logged 19 failed sign-ins, 27 expired or replayed requests and 4 invalid device claims, and it detected 2 session hijack attempts (Tables 15 and 16).</w:t>
       </w:r>
     </w:p>
     <w:p>
@@ -26734,6 +27746,24 @@
         <w:ind w:left="284"/>
       </w:pPr>
       <w:r>
+        <w:t xml:space="preserve">Dellosa, R. M. (2011). Development of student monitoring system with the use of low frequency radio frequency identification (RFID) and short messaging service (SMS). Lyceum of the Philippines–Laguna Research Journal, 1(1). https://ejournals.ph/article.php?id=6683</w:t>
+      </w:r>
+    </w:p>
+    <w:p>
+      <w:pPr>
+        <w:spacing w:line="480" w:lineRule="auto"/>
+        <w:ind w:left="284"/>
+      </w:pPr>
+      <w:r>
+        <w:t xml:space="preserve">El Mrabet, H., &amp; Ait Moussa, A. (2020). IoT-school attendance system using RFID technology. International Journal of Interactive Mobile Technologies, 14(14), 95–108. https://doi.org/10.3991/ijim.v14i14.14625</w:t>
+      </w:r>
+    </w:p>
+    <w:p>
+      <w:pPr>
+        <w:spacing w:line="480" w:lineRule="auto"/>
+        <w:ind w:left="284"/>
+      </w:pPr>
+      <w:r>
         <w:t>Ferrag, M. A., Friha, O., Hamouda, D., Maglaras, L., &amp; Janicke, H. (2022). Edge-IIoTset: A new comprehensive realistic cyber security dataset of IoT and IIoT applications for centralized and federated learning. IEEE Access, 10, 40281–40306. https://doi.org/10.1109/ACCESS.2022.3165809</w:t>
       </w:r>
     </w:p>
@@ -26744,6 +27774,24 @@
       </w:pPr>
       <w:r>
         <w:t>International Organization for Standardization. (2022). ISO/IEC 27001:2022 information security, cybersecurity and privacy protection - Information security management systems - Requirements. https://www.iso.org/standard/27001</w:t>
+      </w:r>
+    </w:p>
+    <w:p>
+      <w:pPr>
+        <w:spacing w:line="480" w:lineRule="auto"/>
+        <w:ind w:left="284"/>
+      </w:pPr>
+      <w:r>
+        <w:t xml:space="preserve">Khamaysah, S., Hijjeh, M., &amp; Odeh, M. (2024). IoT-based attendance system using RFID and fingerprint [Undergraduate graduation project, Palestine Polytechnic University]. https://scholar.ppu.edu/items/c32869ac-5717-4a1e-a217-927b4315c35e</w:t>
+      </w:r>
+    </w:p>
+    <w:p>
+      <w:pPr>
+        <w:spacing w:line="480" w:lineRule="auto"/>
+        <w:ind w:left="284"/>
+      </w:pPr>
+      <w:r>
+        <w:t xml:space="preserve">Morallo, I. M. (2015). Lyceum of the Philippines University–Laguna student electronic attendance and logging system (LPU-Laguna SEALS). LPU-Laguna Journal of Multidisciplinary Research, 4(3). https://ejournals.ph/article.php?id=10049</w:t>
       </w:r>
     </w:p>
     <w:p>
@@ -28317,7 +29365,7 @@
         <w:rPr>
           <w:i/>
         </w:rPr>
-        <w:t xml:space="preserve">[Insert the penetration testing checklist based on Table 1]</w:t>
+        <w:t xml:space="preserve">[Insert the penetration testing checklist based on Table 2]</w:t>
       </w:r>
     </w:p>
     <w:p>
@@ -28622,7 +29670,7 @@
         <w:jc w:val="both"/>
       </w:pPr>
       <w:r>
-        <w:t xml:space="preserve">This appendix presents the detailed test results that support Chapter V. Table G1 lists the automated test suites run during development. Table G2 lists all 21 sessions opened during the deployment, with the reason each one was included in or excluded from the recording-time result in Table 17. Table G3 lists the outcome of every RFID tap on October 13–14, 2026, including the two test sessions.</w:t>
+        <w:t xml:space="preserve">This appendix presents the detailed test results that support Chapter V. Table G1 lists the automated test suites run during development. Table G2 lists all 21 sessions opened during the deployment, with the reason each one was included in or excluded from the recording-time result in Table 18. Table G3 lists the outcome of every RFID tap on October 13–14, 2026, including the two test sessions.</w:t>
       </w:r>
     </w:p>
     <w:p>
@@ -29140,7 +30188,7 @@
                 <w:sz w:val="20"/>
                 <w:szCs w:val="20"/>
               </w:rPr>
-              <w:t xml:space="preserve">Use in Table 17</w:t>
+              <w:t xml:space="preserve">Use in Table 18</w:t>
             </w:r>
           </w:p>
         </w:tc>

</xml_diff>